<commit_message>
Retarget Azure deployment manual to AKS
Rework the deployment guide around Azure Kubernetes Service: private
cluster + Azure CNI Overlay, Entra Workload Identity, Key Vault via the
Secrets Store CSI driver, AGIC/WAF ingress, Azure Firewall egress,
cluster-per-env vs namespace topology, Helm + GitOps delivery, and
appendices with K8s/Helm manifests (ServiceAccount, SecretProviderClass,
Ingress, migration Job, GitHub Actions).

https://claude.ai/code/session_01PRGcYxMGt9vC6d1FPpjhaQ
</commit_message>
<xml_diff>
--- a/docs/UIFactory-Azure-Deployment-Manual.docx
+++ b/docs/UIFactory-Azure-Deployment-Manual.docx
@@ -23,7 +23,7 @@
         <w:rPr>
           <w:sz w:val="40"/>
         </w:rPr>
-        <w:t>Azure Deployment Manual</w:t>
+        <w:t>Azure Deployment Manual — AKS</w:t>
       </w:r>
     </w:p>
     <w:p>
@@ -35,7 +35,7 @@
           <w:i/>
           <w:color w:val="6B7785"/>
         </w:rPr>
-        <w:t>Infrastructure, networking &amp; multi-environment delivery (Dev → Test → Prod) · 2026-05-21</w:t>
+        <w:t>Infrastructure, networking &amp; multi-environment delivery on Azure Kubernetes Service (Dev → Test → Prod) · 2026-05-21</w:t>
       </w:r>
     </w:p>
     <w:p/>
@@ -47,7 +47,7 @@
         <w:t xml:space="preserve">Audience. </w:t>
       </w:r>
       <w:r>
-        <w:t>Platform/DevOps engineers provisioning UIFactory on Microsoft Azure. It covers the target architecture, required application changes, identity, secrets, networking, the data and AI tiers, compute/hosting, a three-environment topology, CI/CD, observability, and an ordered provisioning runbook.</w:t>
+        <w:t>Platform/DevOps engineers deploying UIFactory on Azure Kubernetes Service (AKS). It covers the target architecture, required application changes, identity (Entra Workload Identity), secrets (Key Vault via the CSI driver), networking, the data and AI tiers, the AKS cluster and workloads, a three-environment topology, GitOps/CI-CD, observability, and an ordered provisioning runbook.</w:t>
       </w:r>
     </w:p>
     <w:p>
@@ -58,7 +58,7 @@
         <w:t xml:space="preserve">Note. </w:t>
       </w:r>
       <w:r>
-        <w:t>Names, CIDRs and SKUs are illustrative defaults — adapt them to your subscription's policies and IP plan.</w:t>
+        <w:t>Names, CIDRs and SKUs are illustrative — adapt to your subscription policy and IP plan. A lighter serverless alternative (Azure Container Apps) is noted where relevant, but AKS is the primary target here.</w:t>
       </w:r>
     </w:p>
     <w:p>
@@ -80,7 +80,7 @@
           <w:b w:val="0"/>
           <w:i w:val="0"/>
         </w:rPr>
-        <w:t>UIFactory is a two-tier web app: a NestJS API (Node 22) and a React/Vite single-page front end. It depends on a metadata database, an AI provider, Microsoft Entra ID for sign-in, and outbound access to the data sources and agent APIs that builders connect.</w:t>
+        <w:t>UIFactory is a NestJS API (Node 22) plus a React/Vite single-page front end. On AKS both run as containers; the API depends on a metadata database, an AI provider, Microsoft Entra ID for sign-in, and controlled outbound access to the data sources and agent APIs that builders connect.</w:t>
       </w:r>
     </w:p>
     <w:p>
@@ -105,7 +105,7 @@
       <w:tr>
         <w:tc>
           <w:tcPr>
-            <w:tcW w:type="dxa" w:w="2880"/>
+            <w:tcW w:type="dxa" w:w="2736"/>
           </w:tcPr>
           <w:p>
             <w:pPr>
@@ -124,7 +124,7 @@
         </w:tc>
         <w:tc>
           <w:tcPr>
-            <w:tcW w:type="dxa" w:w="3312"/>
+            <w:tcW w:type="dxa" w:w="3600"/>
           </w:tcPr>
           <w:p>
             <w:pPr>
@@ -137,13 +137,13 @@
                 <w:color w:val="FFFFFF"/>
                 <w:sz w:val="18"/>
               </w:rPr>
-              <w:t>Azure service</w:t>
+              <w:t>Azure / Kubernetes service</w:t>
             </w:r>
           </w:p>
         </w:tc>
         <w:tc>
           <w:tcPr>
-            <w:tcW w:type="dxa" w:w="3744"/>
+            <w:tcW w:type="dxa" w:w="3600"/>
           </w:tcPr>
           <w:p>
             <w:pPr>
@@ -164,7 +164,7 @@
       <w:tr>
         <w:tc>
           <w:tcPr>
-            <w:tcW w:type="dxa" w:w="2880"/>
+            <w:tcW w:type="dxa" w:w="2736"/>
           </w:tcPr>
           <w:p>
             <w:r/>
@@ -172,13 +172,13 @@
               <w:rPr>
                 <w:sz w:val="18"/>
               </w:rPr>
-              <w:t>NestJS API (container)</w:t>
+              <w:t>NestJS API</w:t>
             </w:r>
           </w:p>
         </w:tc>
         <w:tc>
           <w:tcPr>
-            <w:tcW w:type="dxa" w:w="3312"/>
+            <w:tcW w:type="dxa" w:w="3600"/>
           </w:tcPr>
           <w:p>
             <w:r/>
@@ -186,13 +186,13 @@
               <w:rPr>
                 <w:sz w:val="18"/>
               </w:rPr>
-              <w:t>Azure Container Apps</w:t>
+              <w:t>AKS Deployment + Service (ClusterIP) + HPA</w:t>
             </w:r>
           </w:p>
         </w:tc>
         <w:tc>
           <w:tcPr>
-            <w:tcW w:type="dxa" w:w="3744"/>
+            <w:tcW w:type="dxa" w:w="3600"/>
           </w:tcPr>
           <w:p>
             <w:r/>
@@ -200,7 +200,7 @@
               <w:rPr>
                 <w:sz w:val="18"/>
               </w:rPr>
-              <w:t>HTTP on :3001, /api prefix; autoscale; revisions; health probe /api/health</w:t>
+              <w:t>Container on :3001, /api prefix; probes on /api/health</w:t>
             </w:r>
           </w:p>
         </w:tc>
@@ -208,7 +208,7 @@
       <w:tr>
         <w:tc>
           <w:tcPr>
-            <w:tcW w:type="dxa" w:w="2880"/>
+            <w:tcW w:type="dxa" w:w="2736"/>
           </w:tcPr>
           <w:p>
             <w:r/>
@@ -222,7 +222,7 @@
         </w:tc>
         <w:tc>
           <w:tcPr>
-            <w:tcW w:type="dxa" w:w="3312"/>
+            <w:tcW w:type="dxa" w:w="3600"/>
           </w:tcPr>
           <w:p>
             <w:r/>
@@ -230,13 +230,13 @@
               <w:rPr>
                 <w:sz w:val="18"/>
               </w:rPr>
-              <w:t>Azure Static Web Apps or Blob static site</w:t>
+              <w:t>AKS Deployment (nginx) — or Static Web Apps/Front Door</w:t>
             </w:r>
           </w:p>
         </w:tc>
         <w:tc>
           <w:tcPr>
-            <w:tcW w:type="dxa" w:w="3744"/>
+            <w:tcW w:type="dxa" w:w="3600"/>
           </w:tcPr>
           <w:p>
             <w:r/>
@@ -244,7 +244,7 @@
               <w:rPr>
                 <w:sz w:val="18"/>
               </w:rPr>
-              <w:t>Built static assets; served behind the same front door as the API</w:t>
+              <w:t>Serves built static assets behind the same ingress host</w:t>
             </w:r>
           </w:p>
         </w:tc>
@@ -252,7 +252,51 @@
       <w:tr>
         <w:tc>
           <w:tcPr>
-            <w:tcW w:type="dxa" w:w="2880"/>
+            <w:tcW w:type="dxa" w:w="2736"/>
+          </w:tcPr>
+          <w:p>
+            <w:r/>
+            <w:r>
+              <w:rPr>
+                <w:sz w:val="18"/>
+              </w:rPr>
+              <w:t>Cluster</w:t>
+            </w:r>
+          </w:p>
+        </w:tc>
+        <w:tc>
+          <w:tcPr>
+            <w:tcW w:type="dxa" w:w="3600"/>
+          </w:tcPr>
+          <w:p>
+            <w:r/>
+            <w:r>
+              <w:rPr>
+                <w:sz w:val="18"/>
+              </w:rPr>
+              <w:t>Azure Kubernetes Service (private cluster)</w:t>
+            </w:r>
+          </w:p>
+        </w:tc>
+        <w:tc>
+          <w:tcPr>
+            <w:tcW w:type="dxa" w:w="3600"/>
+          </w:tcPr>
+          <w:p>
+            <w:r/>
+            <w:r>
+              <w:rPr>
+                <w:sz w:val="18"/>
+              </w:rPr>
+              <w:t>Azure CNI Overlay, system + user node pools, autoscaler</w:t>
+            </w:r>
+          </w:p>
+        </w:tc>
+      </w:tr>
+      <w:tr>
+        <w:tc>
+          <w:tcPr>
+            <w:tcW w:type="dxa" w:w="2736"/>
           </w:tcPr>
           <w:p>
             <w:r/>
@@ -266,7 +310,7 @@
         </w:tc>
         <w:tc>
           <w:tcPr>
-            <w:tcW w:type="dxa" w:w="3312"/>
+            <w:tcW w:type="dxa" w:w="3600"/>
           </w:tcPr>
           <w:p>
             <w:r/>
@@ -280,7 +324,7 @@
         </w:tc>
         <w:tc>
           <w:tcPr>
-            <w:tcW w:type="dxa" w:w="3744"/>
+            <w:tcW w:type="dxa" w:w="3600"/>
           </w:tcPr>
           <w:p>
             <w:r/>
@@ -288,7 +332,7 @@
               <w:rPr>
                 <w:sz w:val="18"/>
               </w:rPr>
-              <w:t>Private registry; pulled via managed identity</w:t>
+              <w:t>Attached to AKS (AcrPull on kubelet identity); private endpoint</w:t>
             </w:r>
           </w:p>
         </w:tc>
@@ -296,7 +340,7 @@
       <w:tr>
         <w:tc>
           <w:tcPr>
-            <w:tcW w:type="dxa" w:w="2880"/>
+            <w:tcW w:type="dxa" w:w="2736"/>
           </w:tcPr>
           <w:p>
             <w:r/>
@@ -304,13 +348,13 @@
               <w:rPr>
                 <w:sz w:val="18"/>
               </w:rPr>
-              <w:t>Platform metadata DB</w:t>
+              <w:t>Metadata DB</w:t>
             </w:r>
           </w:p>
         </w:tc>
         <w:tc>
           <w:tcPr>
-            <w:tcW w:type="dxa" w:w="3312"/>
+            <w:tcW w:type="dxa" w:w="3600"/>
           </w:tcPr>
           <w:p>
             <w:r/>
@@ -324,7 +368,7 @@
         </w:tc>
         <w:tc>
           <w:tcPr>
-            <w:tcW w:type="dxa" w:w="3744"/>
+            <w:tcW w:type="dxa" w:w="3600"/>
           </w:tcPr>
           <w:p>
             <w:r/>
@@ -340,7 +384,7 @@
       <w:tr>
         <w:tc>
           <w:tcPr>
-            <w:tcW w:type="dxa" w:w="2880"/>
+            <w:tcW w:type="dxa" w:w="2736"/>
           </w:tcPr>
           <w:p>
             <w:r/>
@@ -354,7 +398,7 @@
         </w:tc>
         <w:tc>
           <w:tcPr>
-            <w:tcW w:type="dxa" w:w="3312"/>
+            <w:tcW w:type="dxa" w:w="3600"/>
           </w:tcPr>
           <w:p>
             <w:r/>
@@ -362,13 +406,13 @@
               <w:rPr>
                 <w:sz w:val="18"/>
               </w:rPr>
-              <w:t>Azure OpenAI</w:t>
+              <w:t>Azure OpenAI (or per-app Anthropic/OpenAI/agent API)</w:t>
             </w:r>
           </w:p>
         </w:tc>
         <w:tc>
           <w:tcPr>
-            <w:tcW w:type="dxa" w:w="3744"/>
+            <w:tcW w:type="dxa" w:w="3600"/>
           </w:tcPr>
           <w:p>
             <w:r/>
@@ -376,7 +420,7 @@
               <w:rPr>
                 <w:sz w:val="18"/>
               </w:rPr>
-              <w:t>Model deployments; or per-app Anthropic/OpenAI/agent APIs</w:t>
+              <w:t>Model deployments; workload-identity access</w:t>
             </w:r>
           </w:p>
         </w:tc>
@@ -384,7 +428,7 @@
       <w:tr>
         <w:tc>
           <w:tcPr>
-            <w:tcW w:type="dxa" w:w="2880"/>
+            <w:tcW w:type="dxa" w:w="2736"/>
           </w:tcPr>
           <w:p>
             <w:r/>
@@ -398,7 +442,7 @@
         </w:tc>
         <w:tc>
           <w:tcPr>
-            <w:tcW w:type="dxa" w:w="3312"/>
+            <w:tcW w:type="dxa" w:w="3600"/>
           </w:tcPr>
           <w:p>
             <w:r/>
@@ -406,13 +450,13 @@
               <w:rPr>
                 <w:sz w:val="18"/>
               </w:rPr>
-              <w:t>Microsoft Entra ID (Azure AD)</w:t>
+              <w:t>Microsoft Entra ID</w:t>
             </w:r>
           </w:p>
         </w:tc>
         <w:tc>
           <w:tcPr>
-            <w:tcW w:type="dxa" w:w="3744"/>
+            <w:tcW w:type="dxa" w:w="3600"/>
           </w:tcPr>
           <w:p>
             <w:r/>
@@ -420,7 +464,7 @@
               <w:rPr>
                 <w:sz w:val="18"/>
               </w:rPr>
-              <w:t>App registration; OIDC auth-code; Microsoft Graph for org directory</w:t>
+              <w:t>App registration (OIDC); Microsoft Graph for org directory</w:t>
             </w:r>
           </w:p>
         </w:tc>
@@ -428,7 +472,51 @@
       <w:tr>
         <w:tc>
           <w:tcPr>
-            <w:tcW w:type="dxa" w:w="2880"/>
+            <w:tcW w:type="dxa" w:w="2736"/>
+          </w:tcPr>
+          <w:p>
+            <w:r/>
+            <w:r>
+              <w:rPr>
+                <w:sz w:val="18"/>
+              </w:rPr>
+              <w:t>Pod → Azure auth</w:t>
+            </w:r>
+          </w:p>
+        </w:tc>
+        <w:tc>
+          <w:tcPr>
+            <w:tcW w:type="dxa" w:w="3600"/>
+          </w:tcPr>
+          <w:p>
+            <w:r/>
+            <w:r>
+              <w:rPr>
+                <w:sz w:val="18"/>
+              </w:rPr>
+              <w:t>Entra Workload Identity (federated)</w:t>
+            </w:r>
+          </w:p>
+        </w:tc>
+        <w:tc>
+          <w:tcPr>
+            <w:tcW w:type="dxa" w:w="3600"/>
+          </w:tcPr>
+          <w:p>
+            <w:r/>
+            <w:r>
+              <w:rPr>
+                <w:sz w:val="18"/>
+              </w:rPr>
+              <w:t>No node secrets; per-ServiceAccount federation</w:t>
+            </w:r>
+          </w:p>
+        </w:tc>
+      </w:tr>
+      <w:tr>
+        <w:tc>
+          <w:tcPr>
+            <w:tcW w:type="dxa" w:w="2736"/>
           </w:tcPr>
           <w:p>
             <w:r/>
@@ -442,7 +530,7 @@
         </w:tc>
         <w:tc>
           <w:tcPr>
-            <w:tcW w:type="dxa" w:w="3312"/>
+            <w:tcW w:type="dxa" w:w="3600"/>
           </w:tcPr>
           <w:p>
             <w:r/>
@@ -450,13 +538,13 @@
               <w:rPr>
                 <w:sz w:val="18"/>
               </w:rPr>
-              <w:t>Azure Key Vault</w:t>
+              <w:t>Key Vault + Secrets Store CSI Driver</w:t>
             </w:r>
           </w:p>
         </w:tc>
         <w:tc>
           <w:tcPr>
-            <w:tcW w:type="dxa" w:w="3744"/>
+            <w:tcW w:type="dxa" w:w="3600"/>
           </w:tcPr>
           <w:p>
             <w:r/>
@@ -464,7 +552,7 @@
               <w:rPr>
                 <w:sz w:val="18"/>
               </w:rPr>
-              <w:t>JWT_SECRET, SECRETS_KEY, AI keys, Entra client secret, DB password</w:t>
+              <w:t>Mounted/synced to pods via SecretProviderClass</w:t>
             </w:r>
           </w:p>
         </w:tc>
@@ -472,7 +560,7 @@
       <w:tr>
         <w:tc>
           <w:tcPr>
-            <w:tcW w:type="dxa" w:w="2880"/>
+            <w:tcW w:type="dxa" w:w="2736"/>
           </w:tcPr>
           <w:p>
             <w:r/>
@@ -486,7 +574,7 @@
         </w:tc>
         <w:tc>
           <w:tcPr>
-            <w:tcW w:type="dxa" w:w="3312"/>
+            <w:tcW w:type="dxa" w:w="3600"/>
           </w:tcPr>
           <w:p>
             <w:r/>
@@ -494,13 +582,13 @@
               <w:rPr>
                 <w:sz w:val="18"/>
               </w:rPr>
-              <w:t>Azure Front Door (Premium) + WAF</w:t>
+              <w:t>App Gateway Ingress Controller (WAF_v2) — or Front Door</w:t>
             </w:r>
           </w:p>
         </w:tc>
         <w:tc>
           <w:tcPr>
-            <w:tcW w:type="dxa" w:w="3744"/>
+            <w:tcW w:type="dxa" w:w="3600"/>
           </w:tcPr>
           <w:p>
             <w:r/>
@@ -508,7 +596,7 @@
               <w:rPr>
                 <w:sz w:val="18"/>
               </w:rPr>
-              <w:t>Custom domain, TLS, routing /→frontend and /api/*→backend; Private Link to origin</w:t>
+              <w:t>Custom domain, TLS, routes / and /api/*</w:t>
             </w:r>
           </w:p>
         </w:tc>
@@ -516,7 +604,7 @@
       <w:tr>
         <w:tc>
           <w:tcPr>
-            <w:tcW w:type="dxa" w:w="2880"/>
+            <w:tcW w:type="dxa" w:w="2736"/>
           </w:tcPr>
           <w:p>
             <w:r/>
@@ -530,7 +618,7 @@
         </w:tc>
         <w:tc>
           <w:tcPr>
-            <w:tcW w:type="dxa" w:w="3312"/>
+            <w:tcW w:type="dxa" w:w="3600"/>
           </w:tcPr>
           <w:p>
             <w:r/>
@@ -538,13 +626,13 @@
               <w:rPr>
                 <w:sz w:val="18"/>
               </w:rPr>
-              <w:t>NAT Gateway and/or Azure Firewall</w:t>
+              <w:t>Azure Firewall + UDR (or NAT Gateway)</w:t>
             </w:r>
           </w:p>
         </w:tc>
         <w:tc>
           <w:tcPr>
-            <w:tcW w:type="dxa" w:w="3744"/>
+            <w:tcW w:type="dxa" w:w="3600"/>
           </w:tcPr>
           <w:p>
             <w:r/>
@@ -552,7 +640,7 @@
               <w:rPr>
                 <w:sz w:val="18"/>
               </w:rPr>
-              <w:t>Stable outbound IP and/or FQDN filtering for data-source/agent calls</w:t>
+              <w:t>FQDN filtering for data-source/agent calls; stable egress IP</w:t>
             </w:r>
           </w:p>
         </w:tc>
@@ -560,7 +648,7 @@
       <w:tr>
         <w:tc>
           <w:tcPr>
-            <w:tcW w:type="dxa" w:w="2880"/>
+            <w:tcW w:type="dxa" w:w="2736"/>
           </w:tcPr>
           <w:p>
             <w:r/>
@@ -574,7 +662,7 @@
         </w:tc>
         <w:tc>
           <w:tcPr>
-            <w:tcW w:type="dxa" w:w="3312"/>
+            <w:tcW w:type="dxa" w:w="3600"/>
           </w:tcPr>
           <w:p>
             <w:r/>
@@ -582,13 +670,13 @@
               <w:rPr>
                 <w:sz w:val="18"/>
               </w:rPr>
-              <w:t>Virtual Network + Private Endpoints + Private DNS</w:t>
+              <w:t>VNet + Private Endpoints + Private DNS + Network Policy</w:t>
             </w:r>
           </w:p>
         </w:tc>
         <w:tc>
           <w:tcPr>
-            <w:tcW w:type="dxa" w:w="3744"/>
+            <w:tcW w:type="dxa" w:w="3600"/>
           </w:tcPr>
           <w:p>
             <w:r/>
@@ -596,7 +684,7 @@
               <w:rPr>
                 <w:sz w:val="18"/>
               </w:rPr>
-              <w:t>Isolates DB, Key Vault, ACR, Azure OpenAI</w:t>
+              <w:t>Isolates DB, KV, ACR, OpenAI; intra-cluster policy</w:t>
             </w:r>
           </w:p>
         </w:tc>
@@ -604,7 +692,7 @@
       <w:tr>
         <w:tc>
           <w:tcPr>
-            <w:tcW w:type="dxa" w:w="2880"/>
+            <w:tcW w:type="dxa" w:w="2736"/>
           </w:tcPr>
           <w:p>
             <w:r/>
@@ -618,7 +706,7 @@
         </w:tc>
         <w:tc>
           <w:tcPr>
-            <w:tcW w:type="dxa" w:w="3312"/>
+            <w:tcW w:type="dxa" w:w="3600"/>
           </w:tcPr>
           <w:p>
             <w:r/>
@@ -626,13 +714,13 @@
               <w:rPr>
                 <w:sz w:val="18"/>
               </w:rPr>
-              <w:t>Log Analytics + Application Insights</w:t>
+              <w:t>Azure Monitor (Container Insights) + App Insights</w:t>
             </w:r>
           </w:p>
         </w:tc>
         <w:tc>
           <w:tcPr>
-            <w:tcW w:type="dxa" w:w="3744"/>
+            <w:tcW w:type="dxa" w:w="3600"/>
           </w:tcPr>
           <w:p>
             <w:r/>
@@ -640,7 +728,7 @@
               <w:rPr>
                 <w:sz w:val="18"/>
               </w:rPr>
-              <w:t>Logs, metrics, traces, alerts</w:t>
+              <w:t>Cluster + app logs/metrics/traces</w:t>
             </w:r>
           </w:p>
         </w:tc>
@@ -648,7 +736,7 @@
       <w:tr>
         <w:tc>
           <w:tcPr>
-            <w:tcW w:type="dxa" w:w="2880"/>
+            <w:tcW w:type="dxa" w:w="2736"/>
           </w:tcPr>
           <w:p>
             <w:r/>
@@ -656,13 +744,13 @@
               <w:rPr>
                 <w:sz w:val="18"/>
               </w:rPr>
-              <w:t>IaC + CI/CD</w:t>
+              <w:t>IaC + delivery</w:t>
             </w:r>
           </w:p>
         </w:tc>
         <w:tc>
           <w:tcPr>
-            <w:tcW w:type="dxa" w:w="3312"/>
+            <w:tcW w:type="dxa" w:w="3600"/>
           </w:tcPr>
           <w:p>
             <w:r/>
@@ -670,13 +758,13 @@
               <w:rPr>
                 <w:sz w:val="18"/>
               </w:rPr>
-              <w:t>Bicep/Terraform + GitHub Actions</w:t>
+              <w:t>Bicep/Terraform (infra) + Helm + GitOps (Argo/Flux)</w:t>
             </w:r>
           </w:p>
         </w:tc>
         <w:tc>
           <w:tcPr>
-            <w:tcW w:type="dxa" w:w="3744"/>
+            <w:tcW w:type="dxa" w:w="3600"/>
           </w:tcPr>
           <w:p>
             <w:r/>
@@ -684,7 +772,7 @@
               <w:rPr>
                 <w:sz w:val="18"/>
               </w:rPr>
-              <w:t>Per-environment parameterization and gated promotion</w:t>
+              <w:t>Per-env values; gated promotion</w:t>
             </w:r>
           </w:p>
         </w:tc>
@@ -711,31 +799,37 @@
         </w:rPr>
         <w:t>flowchart LR</w:t>
         <w:br/>
-        <w:t xml:space="preserve">  U[Org users] --&gt;|HTTPS| FD[Front Door + WAF]</w:t>
+        <w:t xml:space="preserve">  U[Org users] --&gt;|HTTPS| EDGE[App Gateway WAF_v2 / Front Door]</w:t>
         <w:br/>
-        <w:t xml:space="preserve">  FD --&gt;|/| FE[Front end: Static Web App]</w:t>
+        <w:t xml:space="preserve">  EDGE --&gt; ING[AGIC ingress]</w:t>
         <w:br/>
-        <w:t xml:space="preserve">  FD --&gt;|/api/*  Private Link| ACA[Container Apps: NestJS API]</w:t>
+        <w:t xml:space="preserve">  subgraph AKS [AKS private cluster]</w:t>
+        <w:br/>
+        <w:t xml:space="preserve">    ING --&gt; FE[front end pods - nginx]</w:t>
+        <w:br/>
+        <w:t xml:space="preserve">    ING --&gt; API[NestJS API pods + HPA]</w:t>
+        <w:br/>
+        <w:t xml:space="preserve">    SA[ServiceAccount + Workload Identity] --- API</w:t>
+        <w:br/>
+        <w:t xml:space="preserve">  end</w:t>
         <w:br/>
         <w:t xml:space="preserve">  subgraph VNet</w:t>
         <w:br/>
-        <w:t xml:space="preserve">    ACA --&gt; PE1[(Private Endpoint)]</w:t>
+        <w:t xml:space="preserve">    API --&gt; PE1[(Private Endpoint)] --&gt; PG[(PostgreSQL Flexible Server)]</w:t>
         <w:br/>
-        <w:t xml:space="preserve">    PE1 --&gt; PG[(PostgreSQL Flexible Server)]</w:t>
+        <w:t xml:space="preserve">    API --&gt; PE2[(Private Endpoint)] --&gt; KV[Key Vault]</w:t>
         <w:br/>
-        <w:t xml:space="preserve">    ACA --&gt; PE2[(Private Endpoint)] --&gt; KV[Key Vault]</w:t>
+        <w:t xml:space="preserve">    API --&gt; PE3[(Private Endpoint)] --&gt; AOAI[Azure OpenAI]</w:t>
         <w:br/>
-        <w:t xml:space="preserve">    ACA --&gt; PE3[(Private Endpoint)] --&gt; AOAI[Azure OpenAI]</w:t>
+        <w:t xml:space="preserve">    KUBELET[kubelet identity] --&gt; PE4[(Private Endpoint)] --&gt; ACR[Container Registry]</w:t>
         <w:br/>
-        <w:t xml:space="preserve">    ACA --&gt; PE4[(Private Endpoint)] --&gt; ACR[Container Registry]</w:t>
-        <w:br/>
-        <w:t xml:space="preserve">    ACA --&gt; FW[Azure Firewall / NAT GW]</w:t>
+        <w:t xml:space="preserve">    API --&gt; FW[Azure Firewall / NAT]</w:t>
         <w:br/>
         <w:t xml:space="preserve">  end</w:t>
         <w:br/>
         <w:t xml:space="preserve">  FW --&gt;|allowlisted FQDNs| EXT[External data sources / agent APIs]</w:t>
         <w:br/>
-        <w:t xml:space="preserve">  ACA --&gt;|OIDC + Graph| ENTRA[Microsoft Entra ID]</w:t>
+        <w:t xml:space="preserve">  API --&gt;|OIDC + Graph| ENTRA[Microsoft Entra ID]</w:t>
         <w:br/>
         <w:t/>
       </w:r>
@@ -772,7 +866,7 @@
         <w:t xml:space="preserve">Azure subscription(s). </w:t>
       </w:r>
       <w:r>
-        <w:t>Owner/Contributor + User Access Administrator on the target subscriptions.</w:t>
+        <w:t>Contributor + User Access Administrator on target subscriptions.</w:t>
       </w:r>
     </w:p>
     <w:p>
@@ -786,7 +880,7 @@
         <w:t xml:space="preserve">Entra ID privileges. </w:t>
       </w:r>
       <w:r>
-        <w:t>Ability to create app registrations and grant admin consent for Graph permissions.</w:t>
+        <w:t>Create app registrations and grant admin consent for Graph permissions.</w:t>
       </w:r>
     </w:p>
     <w:p>
@@ -800,7 +894,21 @@
         <w:t xml:space="preserve">Local tooling. </w:t>
       </w:r>
       <w:r>
-        <w:t>Azure CLI (az), Bicep (or Terraform), Docker, Node 22, and GitHub repo admin for CI/CD.</w:t>
+        <w:t>Azure CLI (az) + aks-preview, kubectl, Helm 3, Bicep/Terraform, Docker, and GitHub repo admin.</w:t>
+      </w:r>
+    </w:p>
+    <w:p>
+      <w:pPr>
+        <w:pStyle w:val="ListBullet"/>
+      </w:pPr>
+      <w:r>
+        <w:rPr>
+          <w:b/>
+        </w:rPr>
+        <w:t xml:space="preserve">Cluster access model. </w:t>
+      </w:r>
+      <w:r>
+        <w:t>Enable Azure RBAC for Kubernetes authorization and Entra-integrated cluster admin groups.</w:t>
       </w:r>
     </w:p>
     <w:p>
@@ -814,7 +922,7 @@
         <w:t xml:space="preserve">DNS. </w:t>
       </w:r>
       <w:r>
-        <w:t>A custom domain (e.g. uifactory.contoso.com) you can point at Front Door per environment.</w:t>
+        <w:t>A custom domain per environment to point at the App Gateway / Front Door public endpoint.</w:t>
       </w:r>
     </w:p>
     <w:p>
@@ -823,15 +931,6 @@
       </w:pPr>
       <w:r>
         <w:t>2.2 Application changes required for production</w:t>
-      </w:r>
-    </w:p>
-    <w:p>
-      <w:r>
-        <w:rPr>
-          <w:b w:val="0"/>
-          <w:i w:val="0"/>
-        </w:rPr>
-        <w:t>The repository ships dev-friendly defaults. Make these changes before a production deployment:</w:t>
       </w:r>
     </w:p>
     <w:p>
@@ -845,7 +944,7 @@
         <w:t xml:space="preserve">Use PostgreSQL for metadata. </w:t>
       </w:r>
       <w:r>
-        <w:t>Change the Prisma datasource provider from sqlite to postgresql and set DATABASE_URL to the Flexible Server connection string. Replace `prisma db push` with versioned migrations (`prisma migrate deploy`).</w:t>
+        <w:t>Set the Prisma datasource provider to postgresql and DATABASE_URL to the Flexible Server connection string; replace `prisma db push` with `prisma migrate deploy`.</w:t>
       </w:r>
     </w:p>
     <w:p>
@@ -859,7 +958,35 @@
         <w:t xml:space="preserve">Containerize. </w:t>
       </w:r>
       <w:r>
-        <w:t>Add a backend Dockerfile (Appendix A) and publish the front end as static assets (Appendix B).</w:t>
+        <w:t>Backend Dockerfile (Appendix A) pushed to ACR; front end as an nginx image or Static Web Apps (Appendix B).</w:t>
+      </w:r>
+    </w:p>
+    <w:p>
+      <w:pPr>
+        <w:pStyle w:val="ListBullet"/>
+      </w:pPr>
+      <w:r>
+        <w:rPr>
+          <w:b/>
+        </w:rPr>
+        <w:t xml:space="preserve">Kubernetes manifests / Helm chart. </w:t>
+      </w:r>
+      <w:r>
+        <w:t>Deployment, Service, Ingress, HPA, ServiceAccount (workload identity), SecretProviderClass, and a migration Job (Appendices C–D).</w:t>
+      </w:r>
+    </w:p>
+    <w:p>
+      <w:pPr>
+        <w:pStyle w:val="ListBullet"/>
+      </w:pPr>
+      <w:r>
+        <w:rPr>
+          <w:b/>
+        </w:rPr>
+        <w:t xml:space="preserve">Probes. </w:t>
+      </w:r>
+      <w:r>
+        <w:t>Liveness/readiness on GET /api/health; set resource requests/limits.</w:t>
       </w:r>
     </w:p>
     <w:p>
@@ -873,7 +1000,7 @@
         <w:t xml:space="preserve">Production cookies. </w:t>
       </w:r>
       <w:r>
-        <w:t>Run with NODE_ENV=production so session cookies are Secure; set FRONTEND_URL to the public origin.</w:t>
+        <w:t>NODE_ENV=production (Secure cookies); FRONTEND_URL set to the public origin.</w:t>
       </w:r>
     </w:p>
     <w:p>
@@ -884,10 +1011,10 @@
         <w:rPr>
           <w:b/>
         </w:rPr>
-        <w:t xml:space="preserve">Per-environment Entra config. </w:t>
+        <w:t xml:space="preserve">Per-env Entra config. </w:t>
       </w:r>
       <w:r>
-        <w:t>Set AZURE_AD_* and AZURE_AD_REDIRECT_URI to each environment's callback URL.</w:t>
+        <w:t>AZURE_AD_* and AZURE_AD_REDIRECT_URI set to each environment's callback URL.</w:t>
       </w:r>
     </w:p>
     <w:p>
@@ -901,7 +1028,7 @@
         <w:t xml:space="preserve">Encryption key. </w:t>
       </w:r>
       <w:r>
-        <w:t>Provide a unique 32-byte SECRETS_KEY per environment (Key Vault); never reuse keys across envs.</w:t>
+        <w:t>Unique 32-byte SECRETS_KEY per environment, delivered from Key Vault via the CSI driver.</w:t>
       </w:r>
     </w:p>
     <w:p>
@@ -915,7 +1042,7 @@
         <w:t xml:space="preserve">Outbound policy. </w:t>
       </w:r>
       <w:r>
-        <w:t>Decide ALLOW_PRIVATE_NETWORK / OUTBOUND_ALLOWLIST (see §5.3); keep private-IP blocking on in prod.</w:t>
+        <w:t>Keep SSRF private-IP blocking on in prod; allow specific internal sources via OUTBOUND_ALLOWLIST.</w:t>
       </w:r>
     </w:p>
     <w:p>
@@ -929,7 +1056,7 @@
         <w:t xml:space="preserve">Ephemeral SQLite caveat. </w:t>
       </w:r>
       <w:r>
-        <w:t>The SQLite *data-source* connector reads a file path on the container's local disk — fine for demos, but not durable in Container Apps. Prefer PostgreSQL/REST sources, or mount Azure Files if needed.</w:t>
+        <w:t>The SQLite data-source connector uses a pod-local file path — not durable; prefer PostgreSQL/REST sources, or mount Azure Files via a PVC if a file DB is unavoidable.</w:t>
       </w:r>
     </w:p>
     <w:p>
@@ -942,7 +1069,63 @@
         <w:pStyle w:val="Heading1"/>
       </w:pPr>
       <w:r>
-        <w:t>3. Identity &amp; access (Microsoft Entra ID)</w:t>
+        <w:t>3. Identity &amp; access</w:t>
+      </w:r>
+    </w:p>
+    <w:p>
+      <w:pPr>
+        <w:pStyle w:val="Heading2"/>
+      </w:pPr>
+      <w:r>
+        <w:t>3.1 Sign-in (Microsoft Entra ID app registration)</w:t>
+      </w:r>
+    </w:p>
+    <w:p>
+      <w:pPr>
+        <w:pStyle w:val="ListNumber"/>
+      </w:pPr>
+      <w:r>
+        <w:t>Register one app per environment (e.g. 'uifactory-prod').</w:t>
+      </w:r>
+    </w:p>
+    <w:p>
+      <w:pPr>
+        <w:pStyle w:val="ListNumber"/>
+      </w:pPr>
+      <w:r>
+        <w:t>Add Web redirect URI https://&lt;env-host&gt;/api/auth/callback.</w:t>
+      </w:r>
+    </w:p>
+    <w:p>
+      <w:pPr>
+        <w:pStyle w:val="ListNumber"/>
+      </w:pPr>
+      <w:r>
+        <w:t>Create a client secret (stored in Key Vault).</w:t>
+      </w:r>
+    </w:p>
+    <w:p>
+      <w:pPr>
+        <w:pStyle w:val="ListNumber"/>
+      </w:pPr>
+      <w:r>
+        <w:t>Delegated permissions openid, profile, email; for the org directory picker add Graph application permission User.Read.All with admin consent.</w:t>
+      </w:r>
+    </w:p>
+    <w:p>
+      <w:pPr>
+        <w:pStyle w:val="ListNumber"/>
+      </w:pPr>
+      <w:r>
+        <w:t>Map Tenant ID / Client ID / secret to AZURE_AD_TENANT_ID / AZURE_AD_CLIENT_ID / AZURE_AD_CLIENT_SECRET.</w:t>
+      </w:r>
+    </w:p>
+    <w:p>
+      <w:pPr>
+        <w:pStyle w:val="Heading2"/>
+      </w:pPr>
+      <w:r>
+        <w:t>3.2 Pod-to-Azure auth — Entra Workload Identity</w:t>
       </w:r>
     </w:p>
     <w:p>
@@ -951,15 +1134,7 @@
           <w:b w:val="0"/>
           <w:i w:val="0"/>
         </w:rPr>
-        <w:t>Register one application per environment (recommended) so redirect URIs, secrets and consent are isolated.</w:t>
-      </w:r>
-    </w:p>
-    <w:p>
-      <w:pPr>
-        <w:pStyle w:val="Heading2"/>
-      </w:pPr>
-      <w:r>
-        <w:t>3.1 App registration</w:t>
+        <w:t>Avoid storing cloud credentials in the cluster. Use AKS Workload Identity so the API pod authenticates to Azure as a user-assigned managed identity:</w:t>
       </w:r>
     </w:p>
     <w:p>
@@ -967,7 +1142,7 @@
         <w:pStyle w:val="ListNumber"/>
       </w:pPr>
       <w:r>
-        <w:t>Create an app registration, e.g. 'uifactory-prod'.</w:t>
+        <w:t>Enable the AKS OIDC issuer and Workload Identity (`--enable-oidc-issuer --enable-workload-identity`).</w:t>
       </w:r>
     </w:p>
     <w:p>
@@ -975,7 +1150,7 @@
         <w:pStyle w:val="ListNumber"/>
       </w:pPr>
       <w:r>
-        <w:t>Add a Web redirect URI: https://&lt;env-host&gt;/api/auth/callback (one per environment).</w:t>
+        <w:t>Create a user-assigned managed identity for the workload.</w:t>
       </w:r>
     </w:p>
     <w:p>
@@ -983,7 +1158,7 @@
         <w:pStyle w:val="ListNumber"/>
       </w:pPr>
       <w:r>
-        <w:t>Create a client secret (store in Key Vault as the Entra client secret).</w:t>
+        <w:t>Create a federated identity credential mapping the cluster issuer + namespace:serviceaccount to that identity.</w:t>
       </w:r>
     </w:p>
     <w:p>
@@ -991,23 +1166,7 @@
         <w:pStyle w:val="ListNumber"/>
       </w:pPr>
       <w:r>
-        <w:t>API permissions — delegated openid, profile, email (sign-in). For the organization directory picker add Microsoft Graph application permission User.Read.All and grant admin consent.</w:t>
-      </w:r>
-    </w:p>
-    <w:p>
-      <w:pPr>
-        <w:pStyle w:val="ListNumber"/>
-      </w:pPr>
-      <w:r>
-        <w:t>Record Tenant ID, Client ID; map them to AZURE_AD_TENANT_ID / AZURE_AD_CLIENT_ID / AZURE_AD_CLIENT_SECRET.</w:t>
-      </w:r>
-    </w:p>
-    <w:p>
-      <w:pPr>
-        <w:pStyle w:val="Heading2"/>
-      </w:pPr>
-      <w:r>
-        <w:t>3.2 Managed identity &amp; RBAC</w:t>
+        <w:t>Annotate the Kubernetes ServiceAccount with azure.workload.identity/client-id and label pods azure.workload.identity/use: "true".</w:t>
       </w:r>
     </w:p>
     <w:p>
@@ -1016,7 +1175,7 @@
           <w:b w:val="0"/>
           <w:i w:val="0"/>
         </w:rPr>
-        <w:t>Assign the Container App a user-assigned managed identity and grant least-privilege roles:</w:t>
+        <w:t>Role assignments (least privilege):</w:t>
       </w:r>
     </w:p>
     <w:tbl>
@@ -1033,7 +1192,26 @@
       <w:tr>
         <w:tc>
           <w:tcPr>
-            <w:tcW w:type="dxa" w:w="3168"/>
+            <w:tcW w:type="dxa" w:w="3456"/>
+          </w:tcPr>
+          <w:p>
+            <w:pPr>
+              <w:shd w:val="clear" w:fill="3A64F0"/>
+            </w:pPr>
+            <w:r/>
+            <w:r>
+              <w:rPr>
+                <w:b/>
+                <w:color w:val="FFFFFF"/>
+                <w:sz w:val="18"/>
+              </w:rPr>
+              <w:t>Identity</w:t>
+            </w:r>
+          </w:p>
+        </w:tc>
+        <w:tc>
+          <w:tcPr>
+            <w:tcW w:type="dxa" w:w="2880"/>
           </w:tcPr>
           <w:p>
             <w:pPr>
@@ -1052,7 +1230,7 @@
         </w:tc>
         <w:tc>
           <w:tcPr>
-            <w:tcW w:type="dxa" w:w="3456"/>
+            <w:tcW w:type="dxa" w:w="3312"/>
           </w:tcPr>
           <w:p>
             <w:pPr>
@@ -1069,30 +1247,25 @@
             </w:r>
           </w:p>
         </w:tc>
-        <w:tc>
-          <w:tcPr>
-            <w:tcW w:type="dxa" w:w="3312"/>
-          </w:tcPr>
-          <w:p>
-            <w:pPr>
-              <w:shd w:val="clear" w:fill="3A64F0"/>
-            </w:pPr>
-            <w:r/>
-            <w:r>
-              <w:rPr>
-                <w:b/>
-                <w:color w:val="FFFFFF"/>
-                <w:sz w:val="18"/>
-              </w:rPr>
-              <w:t>Why</w:t>
-            </w:r>
-          </w:p>
-        </w:tc>
       </w:tr>
       <w:tr>
         <w:tc>
           <w:tcPr>
-            <w:tcW w:type="dxa" w:w="3168"/>
+            <w:tcW w:type="dxa" w:w="3456"/>
+          </w:tcPr>
+          <w:p>
+            <w:r/>
+            <w:r>
+              <w:rPr>
+                <w:sz w:val="18"/>
+              </w:rPr>
+              <w:t>Workload identity (API pod)</w:t>
+            </w:r>
+          </w:p>
+        </w:tc>
+        <w:tc>
+          <w:tcPr>
+            <w:tcW w:type="dxa" w:w="2880"/>
           </w:tcPr>
           <w:p>
             <w:r/>
@@ -1106,6 +1279,22 @@
         </w:tc>
         <w:tc>
           <w:tcPr>
+            <w:tcW w:type="dxa" w:w="3312"/>
+          </w:tcPr>
+          <w:p>
+            <w:r/>
+            <w:r>
+              <w:rPr>
+                <w:sz w:val="18"/>
+              </w:rPr>
+              <w:t>Key Vault Secrets User</w:t>
+            </w:r>
+          </w:p>
+        </w:tc>
+      </w:tr>
+      <w:tr>
+        <w:tc>
+          <w:tcPr>
             <w:tcW w:type="dxa" w:w="3456"/>
           </w:tcPr>
           <w:p>
@@ -1114,7 +1303,21 @@
               <w:rPr>
                 <w:sz w:val="18"/>
               </w:rPr>
-              <w:t>Key Vault Secrets User</w:t>
+              <w:t>Workload identity (API pod)</w:t>
+            </w:r>
+          </w:p>
+        </w:tc>
+        <w:tc>
+          <w:tcPr>
+            <w:tcW w:type="dxa" w:w="2880"/>
+          </w:tcPr>
+          <w:p>
+            <w:r/>
+            <w:r>
+              <w:rPr>
+                <w:sz w:val="18"/>
+              </w:rPr>
+              <w:t>Azure OpenAI</w:t>
             </w:r>
           </w:p>
         </w:tc>
@@ -1128,7 +1331,7 @@
               <w:rPr>
                 <w:sz w:val="18"/>
               </w:rPr>
-              <w:t>Read secrets at runtime / via Key Vault references</w:t>
+              <w:t>Cognitive Services OpenAI User</w:t>
             </w:r>
           </w:p>
         </w:tc>
@@ -1136,7 +1339,21 @@
       <w:tr>
         <w:tc>
           <w:tcPr>
-            <w:tcW w:type="dxa" w:w="3168"/>
+            <w:tcW w:type="dxa" w:w="3456"/>
+          </w:tcPr>
+          <w:p>
+            <w:r/>
+            <w:r>
+              <w:rPr>
+                <w:sz w:val="18"/>
+              </w:rPr>
+              <w:t>AKS kubelet identity</w:t>
+            </w:r>
+          </w:p>
+        </w:tc>
+        <w:tc>
+          <w:tcPr>
+            <w:tcW w:type="dxa" w:w="2880"/>
           </w:tcPr>
           <w:p>
             <w:r/>
@@ -1150,6 +1367,22 @@
         </w:tc>
         <w:tc>
           <w:tcPr>
+            <w:tcW w:type="dxa" w:w="3312"/>
+          </w:tcPr>
+          <w:p>
+            <w:r/>
+            <w:r>
+              <w:rPr>
+                <w:sz w:val="18"/>
+              </w:rPr>
+              <w:t>AcrPull (via `az aks update --attach-acr`)</w:t>
+            </w:r>
+          </w:p>
+        </w:tc>
+      </w:tr>
+      <w:tr>
+        <w:tc>
+          <w:tcPr>
             <w:tcW w:type="dxa" w:w="3456"/>
           </w:tcPr>
           <w:p>
@@ -1158,7 +1391,21 @@
               <w:rPr>
                 <w:sz w:val="18"/>
               </w:rPr>
-              <w:t>AcrPull</w:t>
+              <w:t>AGIC identity</w:t>
+            </w:r>
+          </w:p>
+        </w:tc>
+        <w:tc>
+          <w:tcPr>
+            <w:tcW w:type="dxa" w:w="2880"/>
+          </w:tcPr>
+          <w:p>
+            <w:r/>
+            <w:r>
+              <w:rPr>
+                <w:sz w:val="18"/>
+              </w:rPr>
+              <w:t>App Gateway / RG</w:t>
             </w:r>
           </w:p>
         </w:tc>
@@ -1172,95 +1419,7 @@
               <w:rPr>
                 <w:sz w:val="18"/>
               </w:rPr>
-              <w:t>Pull the application image</w:t>
-            </w:r>
-          </w:p>
-        </w:tc>
-      </w:tr>
-      <w:tr>
-        <w:tc>
-          <w:tcPr>
-            <w:tcW w:type="dxa" w:w="3168"/>
-          </w:tcPr>
-          <w:p>
-            <w:r/>
-            <w:r>
-              <w:rPr>
-                <w:sz w:val="18"/>
-              </w:rPr>
-              <w:t>Azure OpenAI</w:t>
-            </w:r>
-          </w:p>
-        </w:tc>
-        <w:tc>
-          <w:tcPr>
-            <w:tcW w:type="dxa" w:w="3456"/>
-          </w:tcPr>
-          <w:p>
-            <w:r/>
-            <w:r>
-              <w:rPr>
-                <w:sz w:val="18"/>
-              </w:rPr>
-              <w:t>Cognitive Services OpenAI User</w:t>
-            </w:r>
-          </w:p>
-        </w:tc>
-        <w:tc>
-          <w:tcPr>
-            <w:tcW w:type="dxa" w:w="3312"/>
-          </w:tcPr>
-          <w:p>
-            <w:r/>
-            <w:r>
-              <w:rPr>
-                <w:sz w:val="18"/>
-              </w:rPr>
-              <w:t>Call model deployments without a key</w:t>
-            </w:r>
-          </w:p>
-        </w:tc>
-      </w:tr>
-      <w:tr>
-        <w:tc>
-          <w:tcPr>
-            <w:tcW w:type="dxa" w:w="3168"/>
-          </w:tcPr>
-          <w:p>
-            <w:r/>
-            <w:r>
-              <w:rPr>
-                <w:sz w:val="18"/>
-              </w:rPr>
-              <w:t>App Insights</w:t>
-            </w:r>
-          </w:p>
-        </w:tc>
-        <w:tc>
-          <w:tcPr>
-            <w:tcW w:type="dxa" w:w="3456"/>
-          </w:tcPr>
-          <w:p>
-            <w:r/>
-            <w:r>
-              <w:rPr>
-                <w:sz w:val="18"/>
-              </w:rPr>
-              <w:t>Monitoring Metrics Publisher</w:t>
-            </w:r>
-          </w:p>
-        </w:tc>
-        <w:tc>
-          <w:tcPr>
-            <w:tcW w:type="dxa" w:w="3312"/>
-          </w:tcPr>
-          <w:p>
-            <w:r/>
-            <w:r>
-              <w:rPr>
-                <w:sz w:val="18"/>
-              </w:rPr>
-              <w:t>Emit telemetry</w:t>
+              <w:t>Contributor on the App Gateway (managed by the AGIC addon)</w:t>
             </w:r>
           </w:p>
         </w:tc>
@@ -1277,7 +1436,7 @@
         <w:pStyle w:val="Heading1"/>
       </w:pPr>
       <w:r>
-        <w:t>4. Secrets management (Key Vault)</w:t>
+        <w:t>4. Secrets management (Key Vault + CSI driver)</w:t>
       </w:r>
     </w:p>
     <w:p>
@@ -1286,7 +1445,7 @@
           <w:b w:val="0"/>
           <w:i w:val="0"/>
         </w:rPr>
-        <w:t>Create one Key Vault per environment (RBAC-enabled, soft-delete + purge protection in prod, private endpoint). Reference secrets from Container Apps as secret references resolved by the managed identity.</w:t>
+        <w:t>Create one Key Vault per environment (RBAC-enabled, soft-delete + purge protection in prod, private endpoint). Enable the AKS addon `azure-keyvault-secrets-provider` and reference secrets with a SecretProviderClass that uses the workload identity; optionally sync them into a Kubernetes Secret consumed as environment variables.</w:t>
       </w:r>
     </w:p>
     <w:tbl>
@@ -1442,7 +1601,7 @@
               <w:rPr>
                 <w:sz w:val="18"/>
               </w:rPr>
-              <w:t>Long random string; unique per env</w:t>
+              <w:t>Long random; unique per env</w:t>
             </w:r>
           </w:p>
         </w:tc>
@@ -1574,7 +1733,7 @@
               <w:rPr>
                 <w:sz w:val="18"/>
               </w:rPr>
-              <w:t>Optional if using managed identity instead</w:t>
+              <w:t>Optional if using workload identity</w:t>
             </w:r>
           </w:p>
         </w:tc>
@@ -1618,7 +1777,7 @@
               <w:rPr>
                 <w:sz w:val="18"/>
               </w:rPr>
-              <w:t>Only if a platform-default non-Azure provider is used</w:t>
+              <w:t>Only for a non-Azure platform-default provider</w:t>
             </w:r>
           </w:p>
         </w:tc>
@@ -1632,7 +1791,7 @@
           <w:i/>
           <w:color w:val="6B7785"/>
         </w:rPr>
-        <w:t>Per-app AI/agent keys entered by builders are encrypted with SECRETS_KEY and stored in the database — they are not Key Vault secrets, so protect the database accordingly.</w:t>
+        <w:t>Per-app AI/agent keys entered by builders are encrypted with SECRETS_KEY and stored in the database — protect the database accordingly.</w:t>
       </w:r>
     </w:p>
     <w:p>
@@ -1662,7 +1821,7 @@
           <w:b w:val="0"/>
           <w:i w:val="0"/>
         </w:rPr>
-        <w:t>Provision a dedicated VNet per environment (non-overlapping CIDRs so they can peer if needed). Example /16 plan:</w:t>
+        <w:t>Dedicated VNet per environment (non-overlapping CIDRs). With Azure CNI Overlay, pods use an overlay CIDR and only nodes consume VNet IPs. Example /16 plan:</w:t>
       </w:r>
     </w:p>
     <w:tbl>
@@ -1680,7 +1839,7 @@
       <w:tr>
         <w:tc>
           <w:tcPr>
-            <w:tcW w:type="dxa" w:w="2304"/>
+            <w:tcW w:type="dxa" w:w="2448"/>
           </w:tcPr>
           <w:p>
             <w:pPr>
@@ -1718,7 +1877,7 @@
         </w:tc>
         <w:tc>
           <w:tcPr>
-            <w:tcW w:type="dxa" w:w="3600"/>
+            <w:tcW w:type="dxa" w:w="3456"/>
           </w:tcPr>
           <w:p>
             <w:pPr>
@@ -1750,7 +1909,7 @@
                 <w:color w:val="FFFFFF"/>
                 <w:sz w:val="18"/>
               </w:rPr>
-              <w:t>Delegation</w:t>
+              <w:t>Notes</w:t>
             </w:r>
           </w:p>
         </w:tc>
@@ -1758,7 +1917,7 @@
       <w:tr>
         <w:tc>
           <w:tcPr>
-            <w:tcW w:type="dxa" w:w="2304"/>
+            <w:tcW w:type="dxa" w:w="2448"/>
           </w:tcPr>
           <w:p>
             <w:r/>
@@ -1766,7 +1925,7 @@
               <w:rPr>
                 <w:sz w:val="18"/>
               </w:rPr>
-              <w:t>snet-aca</w:t>
+              <w:t>snet-aks-nodes</w:t>
             </w:r>
           </w:p>
         </w:tc>
@@ -1780,13 +1939,13 @@
               <w:rPr>
                 <w:sz w:val="18"/>
               </w:rPr>
-              <w:t>10.x.0.0/23</w:t>
+              <w:t>10.x.0.0/22</w:t>
             </w:r>
           </w:p>
         </w:tc>
         <w:tc>
           <w:tcPr>
-            <w:tcW w:type="dxa" w:w="3600"/>
+            <w:tcW w:type="dxa" w:w="3456"/>
           </w:tcPr>
           <w:p>
             <w:r/>
@@ -1794,7 +1953,7 @@
               <w:rPr>
                 <w:sz w:val="18"/>
               </w:rPr>
-              <w:t>Container Apps environment (workload profile)</w:t>
+              <w:t>AKS node pools (system + user)</w:t>
             </w:r>
           </w:p>
         </w:tc>
@@ -1808,7 +1967,7 @@
               <w:rPr>
                 <w:sz w:val="18"/>
               </w:rPr>
-              <w:t>Microsoft.App/environments</w:t>
+              <w:t>Azure CNI Overlay; pod CIDR e.g. 10.244.0.0/16</w:t>
             </w:r>
           </w:p>
         </w:tc>
@@ -1816,7 +1975,7 @@
       <w:tr>
         <w:tc>
           <w:tcPr>
-            <w:tcW w:type="dxa" w:w="2304"/>
+            <w:tcW w:type="dxa" w:w="2448"/>
           </w:tcPr>
           <w:p>
             <w:r/>
@@ -1838,13 +1997,13 @@
               <w:rPr>
                 <w:sz w:val="18"/>
               </w:rPr>
-              <w:t>10.x.2.0/24</w:t>
+              <w:t>10.x.4.0/24</w:t>
             </w:r>
           </w:p>
         </w:tc>
         <w:tc>
           <w:tcPr>
-            <w:tcW w:type="dxa" w:w="3600"/>
+            <w:tcW w:type="dxa" w:w="3456"/>
           </w:tcPr>
           <w:p>
             <w:r/>
@@ -1874,7 +2033,7 @@
       <w:tr>
         <w:tc>
           <w:tcPr>
-            <w:tcW w:type="dxa" w:w="2304"/>
+            <w:tcW w:type="dxa" w:w="2448"/>
           </w:tcPr>
           <w:p>
             <w:r/>
@@ -1896,13 +2055,13 @@
               <w:rPr>
                 <w:sz w:val="18"/>
               </w:rPr>
-              <w:t>10.x.3.0/24</w:t>
+              <w:t>10.x.5.0/24</w:t>
             </w:r>
           </w:p>
         </w:tc>
         <w:tc>
           <w:tcPr>
-            <w:tcW w:type="dxa" w:w="3600"/>
+            <w:tcW w:type="dxa" w:w="3456"/>
           </w:tcPr>
           <w:p>
             <w:r/>
@@ -1924,7 +2083,7 @@
               <w:rPr>
                 <w:sz w:val="18"/>
               </w:rPr>
-              <w:t>Microsoft.DBforPostgreSQL/flexibleServers</w:t>
+              <w:t>Delegated to flexibleServers</w:t>
             </w:r>
           </w:p>
         </w:tc>
@@ -1932,7 +2091,65 @@
       <w:tr>
         <w:tc>
           <w:tcPr>
-            <w:tcW w:type="dxa" w:w="2304"/>
+            <w:tcW w:type="dxa" w:w="2448"/>
+          </w:tcPr>
+          <w:p>
+            <w:r/>
+            <w:r>
+              <w:rPr>
+                <w:sz w:val="18"/>
+              </w:rPr>
+              <w:t>snet-agw</w:t>
+            </w:r>
+          </w:p>
+        </w:tc>
+        <w:tc>
+          <w:tcPr>
+            <w:tcW w:type="dxa" w:w="2016"/>
+          </w:tcPr>
+          <w:p>
+            <w:r/>
+            <w:r>
+              <w:rPr>
+                <w:sz w:val="18"/>
+              </w:rPr>
+              <w:t>10.x.6.0/24</w:t>
+            </w:r>
+          </w:p>
+        </w:tc>
+        <w:tc>
+          <w:tcPr>
+            <w:tcW w:type="dxa" w:w="3456"/>
+          </w:tcPr>
+          <w:p>
+            <w:r/>
+            <w:r>
+              <w:rPr>
+                <w:sz w:val="18"/>
+              </w:rPr>
+              <w:t>Application Gateway (AGIC + WAF_v2)</w:t>
+            </w:r>
+          </w:p>
+        </w:tc>
+        <w:tc>
+          <w:tcPr>
+            <w:tcW w:type="dxa" w:w="2592"/>
+          </w:tcPr>
+          <w:p>
+            <w:r/>
+            <w:r>
+              <w:rPr>
+                <w:sz w:val="18"/>
+              </w:rPr>
+              <w:t>Ingress tier</w:t>
+            </w:r>
+          </w:p>
+        </w:tc>
+      </w:tr>
+      <w:tr>
+        <w:tc>
+          <w:tcPr>
+            <w:tcW w:type="dxa" w:w="2448"/>
           </w:tcPr>
           <w:p>
             <w:r/>
@@ -1954,13 +2171,13 @@
               <w:rPr>
                 <w:sz w:val="18"/>
               </w:rPr>
-              <w:t>10.x.4.0/26</w:t>
+              <w:t>10.x.7.0/26</w:t>
             </w:r>
           </w:p>
         </w:tc>
         <w:tc>
           <w:tcPr>
-            <w:tcW w:type="dxa" w:w="3600"/>
+            <w:tcW w:type="dxa" w:w="3456"/>
           </w:tcPr>
           <w:p>
             <w:r/>
@@ -1982,65 +2199,7 @@
               <w:rPr>
                 <w:sz w:val="18"/>
               </w:rPr>
-              <w:t>—</w:t>
-            </w:r>
-          </w:p>
-        </w:tc>
-      </w:tr>
-      <w:tr>
-        <w:tc>
-          <w:tcPr>
-            <w:tcW w:type="dxa" w:w="2304"/>
-          </w:tcPr>
-          <w:p>
-            <w:r/>
-            <w:r>
-              <w:rPr>
-                <w:sz w:val="18"/>
-              </w:rPr>
-              <w:t>snet-agw</w:t>
-            </w:r>
-          </w:p>
-        </w:tc>
-        <w:tc>
-          <w:tcPr>
-            <w:tcW w:type="dxa" w:w="2016"/>
-          </w:tcPr>
-          <w:p>
-            <w:r/>
-            <w:r>
-              <w:rPr>
-                <w:sz w:val="18"/>
-              </w:rPr>
-              <w:t>10.x.5.0/24</w:t>
-            </w:r>
-          </w:p>
-        </w:tc>
-        <w:tc>
-          <w:tcPr>
-            <w:tcW w:type="dxa" w:w="3600"/>
-          </w:tcPr>
-          <w:p>
-            <w:r/>
-            <w:r>
-              <w:rPr>
-                <w:sz w:val="18"/>
-              </w:rPr>
-              <w:t>(Optional) App Gateway if not using Front Door</w:t>
-            </w:r>
-          </w:p>
-        </w:tc>
-        <w:tc>
-          <w:tcPr>
-            <w:tcW w:type="dxa" w:w="2592"/>
-          </w:tcPr>
-          <w:p>
-            <w:r/>
-            <w:r>
-              <w:rPr>
-                <w:sz w:val="18"/>
-              </w:rPr>
-              <w:t>—</w:t>
+              <w:t>UDR forces 0.0.0.0/0 → firewall</w:t>
             </w:r>
           </w:p>
         </w:tc>
@@ -2052,16 +2211,57 @@
         <w:pStyle w:val="Heading2"/>
       </w:pPr>
       <w:r>
-        <w:t>5.2 Private endpoints &amp; private DNS zones</w:t>
+        <w:t>5.2 Cluster networking</w:t>
       </w:r>
     </w:p>
     <w:p>
+      <w:pPr>
+        <w:pStyle w:val="ListBullet"/>
+      </w:pPr>
       <w:r>
         <w:rPr>
-          <w:b w:val="0"/>
-          <w:i w:val="0"/>
+          <w:b/>
         </w:rPr>
-        <w:t>Disable public network access on the data/secret/AI tiers and reach them over Private Link. Link these private DNS zones to each VNet:</w:t>
+        <w:t xml:space="preserve">Private cluster. </w:t>
+      </w:r>
+      <w:r>
+        <w:t>Enable a private API server (or authorized IP ranges) so the control plane isn't public.</w:t>
+      </w:r>
+    </w:p>
+    <w:p>
+      <w:pPr>
+        <w:pStyle w:val="ListBullet"/>
+      </w:pPr>
+      <w:r>
+        <w:rPr>
+          <w:b/>
+        </w:rPr>
+        <w:t xml:space="preserve">Data plane. </w:t>
+      </w:r>
+      <w:r>
+        <w:t>Azure CNI Overlay (efficient IPs); enable a Network Policy engine (Cilium or Azure NPM) and apply namespace/pod policies (default-deny + explicit allows).</w:t>
+      </w:r>
+    </w:p>
+    <w:p>
+      <w:pPr>
+        <w:pStyle w:val="ListBullet"/>
+      </w:pPr>
+      <w:r>
+        <w:rPr>
+          <w:b/>
+        </w:rPr>
+        <w:t xml:space="preserve">Egress. </w:t>
+      </w:r>
+      <w:r>
+        <w:t>outboundType=userDefinedRouting with a UDR sending 0.0.0.0/0 to Azure Firewall; add application rules for required FQDNs (ACR, Azure Monitor, login.microsoftonline.com, graph.microsoft.com, and approved data sources). Alternatively a NAT Gateway for a stable egress IP without FQDN filtering.</w:t>
+      </w:r>
+    </w:p>
+    <w:p>
+      <w:pPr>
+        <w:pStyle w:val="Heading2"/>
+      </w:pPr>
+      <w:r>
+        <w:t>5.3 Private endpoints &amp; private DNS zones</w:t>
       </w:r>
     </w:p>
     <w:tbl>
@@ -2234,36 +2434,6 @@
           </w:p>
         </w:tc>
       </w:tr>
-      <w:tr>
-        <w:tc>
-          <w:tcPr>
-            <w:tcW w:type="dxa" w:w="4320"/>
-          </w:tcPr>
-          <w:p>
-            <w:r/>
-            <w:r>
-              <w:rPr>
-                <w:sz w:val="18"/>
-              </w:rPr>
-              <w:t>Storage (if used for frontend)</w:t>
-            </w:r>
-          </w:p>
-        </w:tc>
-        <w:tc>
-          <w:tcPr>
-            <w:tcW w:type="dxa" w:w="5040"/>
-          </w:tcPr>
-          <w:p>
-            <w:r/>
-            <w:r>
-              <w:rPr>
-                <w:sz w:val="18"/>
-              </w:rPr>
-              <w:t>privatelink.blob.core.windows.net</w:t>
-            </w:r>
-          </w:p>
-        </w:tc>
-      </w:tr>
     </w:tbl>
     <w:p/>
     <w:p>
@@ -2271,7 +2441,7 @@
         <w:pStyle w:val="Heading2"/>
       </w:pPr>
       <w:r>
-        <w:t>5.3 Ingress, egress &amp; SSRF considerations</w:t>
+        <w:t>5.4 Ingress, TLS &amp; SSRF</w:t>
       </w:r>
     </w:p>
     <w:p>
@@ -2285,7 +2455,7 @@
         <w:t xml:space="preserve">Ingress. </w:t>
       </w:r>
       <w:r>
-        <w:t>Azure Front Door (Premium) terminates TLS, applies WAF, and routes / to the front end and /api/* to the Container App origin over Private Link. Serving both behind one host keeps auth cookies same-site (no CORS).</w:t>
+        <w:t>App Gateway Ingress Controller (WAF_v2) terminates TLS and routes the host: / → front-end Service, /api/* → API Service. Serving both on one host keeps auth cookies same-site (no CORS). Front Door can sit in front for global edge/WAF if desired.</w:t>
       </w:r>
     </w:p>
     <w:p>
@@ -2299,7 +2469,7 @@
         <w:t xml:space="preserve">WAF. </w:t>
       </w:r>
       <w:r>
-        <w:t>Managed rule set in Detection mode for Dev/Test, Prevention mode for Prod.</w:t>
+        <w:t>Detection mode for Dev/Test; Prevention for Prod.</w:t>
       </w:r>
     </w:p>
     <w:p>
@@ -2310,10 +2480,10 @@
         <w:rPr>
           <w:b/>
         </w:rPr>
-        <w:t xml:space="preserve">Egress. </w:t>
+        <w:t xml:space="preserve">TLS. </w:t>
       </w:r>
       <w:r>
-        <w:t>Route outbound through a NAT Gateway (stable egress IP to allowlist with partners) and/or Azure Firewall with FQDN application rules to control which external data sources/agent APIs the platform may reach.</w:t>
+        <w:t>App Gateway listener certificate from Key Vault, or cert-manager (Let's Encrypt) inside the cluster.</w:t>
       </w:r>
     </w:p>
     <w:p>
@@ -2327,21 +2497,7 @@
         <w:t xml:space="preserve">SSRF guard. </w:t>
       </w:r>
       <w:r>
-        <w:t>UIFactory blocks REST/agent/LLM URLs that resolve to private/reserved IPs. To allow specific internal data sources, prefer OUTBOUND_ALLOWLIST (host list) over ALLOW_PRIVATE_NETWORK=true; keep blocking enabled in prod.</w:t>
-      </w:r>
-    </w:p>
-    <w:p>
-      <w:pPr>
-        <w:pStyle w:val="ListBullet"/>
-      </w:pPr>
-      <w:r>
-        <w:rPr>
-          <w:b/>
-        </w:rPr>
-        <w:t xml:space="preserve">NSGs. </w:t>
-      </w:r>
-      <w:r>
-        <w:t>Apply NSGs to each subnet; allow only required flows (Front Door → ACA, ACA → PE subnet, ACA → firewall).</w:t>
+        <w:t>UIFactory blocks REST/agent/LLM URLs resolving to private/reserved IPs. Allow specific internal sources via OUTBOUND_ALLOWLIST rather than disabling the check; keep blocking enabled in prod.</w:t>
       </w:r>
     </w:p>
     <w:p>
@@ -2368,7 +2524,7 @@
         <w:t xml:space="preserve">Deployment. </w:t>
       </w:r>
       <w:r>
-        <w:t>Flexible Server, VNet-integrated (private), TLS required, Microsoft Entra admin enabled.</w:t>
+        <w:t>Flexible Server, VNet-integrated (private), TLS required, Entra admin enabled.</w:t>
       </w:r>
     </w:p>
     <w:p>
@@ -2382,7 +2538,7 @@
         <w:t xml:space="preserve">Sizing. </w:t>
       </w:r>
       <w:r>
-        <w:t>Burstable (B1ms/B2s) for Dev/Test; General Purpose with Zone-redundant HA for Prod.</w:t>
+        <w:t>Burstable for Dev/Test; General Purpose + Zone-redundant HA for Prod.</w:t>
       </w:r>
     </w:p>
     <w:p>
@@ -2396,7 +2552,7 @@
         <w:t xml:space="preserve">Backups. </w:t>
       </w:r>
       <w:r>
-        <w:t>7 days (Dev) → 14 (Test) → 35 days with geo-redundant backup (Prod).</w:t>
+        <w:t>7 days (Dev) → 14 (Test) → 35 days geo-redundant (Prod).</w:t>
       </w:r>
     </w:p>
     <w:p>
@@ -2410,7 +2566,7 @@
         <w:t xml:space="preserve">Migrations. </w:t>
       </w:r>
       <w:r>
-        <w:t>Run `prisma migrate deploy` as a pre-deploy job (init container or pipeline step), not at every replica start.</w:t>
+        <w:t>Run `prisma migrate deploy` as a Helm pre-upgrade hook Job (Appendix D) — once per release, not per replica.</w:t>
       </w:r>
     </w:p>
     <w:p>
@@ -2424,7 +2580,7 @@
         <w:t xml:space="preserve">Least privilege. </w:t>
       </w:r>
       <w:r>
-        <w:t>Use a dedicated application role; do not use the server admin for the app connection.</w:t>
+        <w:t>Dedicated application role; never the server admin in the app connection string.</w:t>
       </w:r>
     </w:p>
     <w:p>
@@ -2451,7 +2607,7 @@
         <w:t xml:space="preserve">Azure OpenAI. </w:t>
       </w:r>
       <w:r>
-        <w:t>Create a resource per environment (or shared with per-env quotas), deploy the chat model(s), and set AZURE_OPENAI_ENDPOINT/DEPLOYMENT/API_VERSION. Prefer managed-identity access; otherwise store the key in Key Vault.</w:t>
+        <w:t>Per-environment resource (or shared with per-env quota); deploy chat model(s); set AZURE_OPENAI_ENDPOINT/DEPLOYMENT/API_VERSION. Prefer workload-identity access; else key in Key Vault.</w:t>
       </w:r>
     </w:p>
     <w:p>
@@ -2465,7 +2621,7 @@
         <w:t xml:space="preserve">Provider flexibility. </w:t>
       </w:r>
       <w:r>
-        <w:t>AI_PROVIDER selects anthropic | openai | azure-openai (auto-detected from keys). Apps may also override with their own provider key or an external agent API URL.</w:t>
+        <w:t>AI_PROVIDER selects anthropic | openai | azure-openai (auto-detected). Apps can override with their own provider key or an external agent API URL.</w:t>
       </w:r>
     </w:p>
     <w:p>
@@ -2479,7 +2635,7 @@
         <w:t xml:space="preserve">Private access. </w:t>
       </w:r>
       <w:r>
-        <w:t>Use a Private Endpoint and disable public network access on the Azure OpenAI resource.</w:t>
+        <w:t>Private endpoint + public network access disabled on the Azure OpenAI resource.</w:t>
       </w:r>
     </w:p>
     <w:p>
@@ -2490,10 +2646,10 @@
         <w:rPr>
           <w:b/>
         </w:rPr>
-        <w:t xml:space="preserve">Cost &amp; limits. </w:t>
+        <w:t xml:space="preserve">Limits. </w:t>
       </w:r>
       <w:r>
-        <w:t>Set TPM quotas per environment; add Front Door/APIM rate limiting if exposing AI-heavy apps broadly.</w:t>
+        <w:t>Set TPM quotas per env; consider APIM/Front Door rate limiting for AI-heavy public apps.</w:t>
       </w:r>
     </w:p>
     <w:p>
@@ -2506,7 +2662,15 @@
         <w:pStyle w:val="Heading1"/>
       </w:pPr>
       <w:r>
-        <w:t>8. Compute &amp; hosting</w:t>
+        <w:t>8. AKS cluster &amp; workloads</w:t>
+      </w:r>
+    </w:p>
+    <w:p>
+      <w:pPr>
+        <w:pStyle w:val="Heading2"/>
+      </w:pPr>
+      <w:r>
+        <w:t>8.1 Cluster</w:t>
       </w:r>
     </w:p>
     <w:p>
@@ -2517,10 +2681,10 @@
         <w:rPr>
           <w:b/>
         </w:rPr>
-        <w:t xml:space="preserve">Container Apps environment. </w:t>
+        <w:t xml:space="preserve">Node pools. </w:t>
       </w:r>
       <w:r>
-        <w:t>VNet-injected into snet-aca; internal ingress so only Front Door (Private Link) reaches it.</w:t>
+        <w:t>A system pool (CriticalAddonsOnly taint) and one or more user pools; enable the cluster autoscaler.</w:t>
       </w:r>
     </w:p>
     <w:p>
@@ -2531,10 +2695,10 @@
         <w:rPr>
           <w:b/>
         </w:rPr>
-        <w:t xml:space="preserve">App settings. </w:t>
+        <w:t xml:space="preserve">Add-ons. </w:t>
       </w:r>
       <w:r>
-        <w:t>PORT=3001, NODE_ENV=production, FRONTEND_URL, AZURE_AD_*, DATABASE_URL, JWT_SECRET, SECRETS_KEY, AI vars — all as Key Vault secret references.</w:t>
+        <w:t>OIDC issuer + Workload Identity, azure-keyvault-secrets-provider (CSI), ingress-appgw (AGIC), and Container Insights monitoring.</w:t>
       </w:r>
     </w:p>
     <w:p>
@@ -2545,10 +2709,10 @@
         <w:rPr>
           <w:b/>
         </w:rPr>
-        <w:t xml:space="preserve">Health probe. </w:t>
+        <w:t xml:space="preserve">Upgrades. </w:t>
       </w:r>
       <w:r>
-        <w:t>Liveness/readiness on GET /api/health.</w:t>
+        <w:t>Use a release channel and maintenance windows; PodDisruptionBudgets to keep replicas during node drains.</w:t>
       </w:r>
     </w:p>
     <w:p>
@@ -2559,10 +2723,18 @@
         <w:rPr>
           <w:b/>
         </w:rPr>
-        <w:t xml:space="preserve">Scaling. </w:t>
+        <w:t xml:space="preserve">Security. </w:t>
       </w:r>
       <w:r>
-        <w:t>Scale on HTTP concurrency; min replicas 0 (Dev) / 1 (Test) / 2+ (Prod) for warm capacity and zone spread.</w:t>
+        <w:t>Azure RBAC for Kubernetes, Entra-integrated admin, Azure Policy for AKS (pod security baseline), read-only root FS / non-root containers where possible.</w:t>
+      </w:r>
+    </w:p>
+    <w:p>
+      <w:pPr>
+        <w:pStyle w:val="Heading2"/>
+      </w:pPr>
+      <w:r>
+        <w:t>8.2 Namespaces &amp; workloads</w:t>
       </w:r>
     </w:p>
     <w:p>
@@ -2573,10 +2745,66 @@
         <w:rPr>
           <w:b/>
         </w:rPr>
-        <w:t xml:space="preserve">Front end. </w:t>
+        <w:t xml:space="preserve">Namespace. </w:t>
       </w:r>
       <w:r>
-        <w:t>Build with `npm run build`; deploy dist via Static Web Apps or Blob static website; front it with the same Front Door profile and route /api/* to the Container App.</w:t>
+        <w:t>One namespace per app/env (e.g. uifactory) with ResourceQuota and LimitRange.</w:t>
+      </w:r>
+    </w:p>
+    <w:p>
+      <w:pPr>
+        <w:pStyle w:val="ListBullet"/>
+      </w:pPr>
+      <w:r>
+        <w:rPr>
+          <w:b/>
+        </w:rPr>
+        <w:t xml:space="preserve">API Deployment. </w:t>
+      </w:r>
+      <w:r>
+        <w:t>2+ replicas (prod), requests/limits set, HPA on CPU/▸ or HTTP metrics, topology spread across zones, ServiceAccount bound to the workload identity, env from the CSI-synced secret.</w:t>
+      </w:r>
+    </w:p>
+    <w:p>
+      <w:pPr>
+        <w:pStyle w:val="ListBullet"/>
+      </w:pPr>
+      <w:r>
+        <w:rPr>
+          <w:b/>
+        </w:rPr>
+        <w:t xml:space="preserve">Front-end Deployment. </w:t>
+      </w:r>
+      <w:r>
+        <w:t>nginx serving the built SPA (or host on Static Web Apps and skip this pod).</w:t>
+      </w:r>
+    </w:p>
+    <w:p>
+      <w:pPr>
+        <w:pStyle w:val="ListBullet"/>
+      </w:pPr>
+      <w:r>
+        <w:rPr>
+          <w:b/>
+        </w:rPr>
+        <w:t xml:space="preserve">Services. </w:t>
+      </w:r>
+      <w:r>
+        <w:t>ClusterIP for both; the Ingress exposes them on the public host.</w:t>
+      </w:r>
+    </w:p>
+    <w:p>
+      <w:pPr>
+        <w:pStyle w:val="ListBullet"/>
+      </w:pPr>
+      <w:r>
+        <w:rPr>
+          <w:b/>
+        </w:rPr>
+        <w:t xml:space="preserve">Config. </w:t>
+      </w:r>
+      <w:r>
+        <w:t>Non-secret env via ConfigMap; secrets via SecretProviderClass → Kubernetes Secret.</w:t>
       </w:r>
     </w:p>
     <w:p>
@@ -2603,7 +2831,7 @@
         <w:t xml:space="preserve">Isolation. </w:t>
       </w:r>
       <w:r>
-        <w:t>One resource group per environment (separate subscription for Prod is recommended). Separate VNet, Key Vault, PostgreSQL, Azure OpenAI, ACR (or a shared ACR with per-env repos).</w:t>
+        <w:t>Recommended: a separate AKS cluster (and VNet, Key Vault, PostgreSQL, Azure OpenAI) per environment, with Prod in its own subscription. Lower-cost option: one cluster with a namespace per environment for Dev/Test, and a dedicated cluster for Prod.</w:t>
       </w:r>
     </w:p>
     <w:p>
@@ -2617,7 +2845,7 @@
         <w:t xml:space="preserve">Naming. </w:t>
       </w:r>
       <w:r>
-        <w:t>rg-uifactory-&lt;env&gt;, ca-uifactory-&lt;env&gt;, pg-uifactory-&lt;env&gt;, kv-uifactory-&lt;env&gt;, with a region/instance suffix.</w:t>
+        <w:t>rg-uifactory-&lt;env&gt;, aks-uifactory-&lt;env&gt;, pg-uifactory-&lt;env&gt;, kv-uifactory-&lt;env&gt; (+region/instance suffix).</w:t>
       </w:r>
     </w:p>
     <w:p>
@@ -2628,10 +2856,10 @@
         <w:rPr>
           <w:b/>
         </w:rPr>
-        <w:t xml:space="preserve">IaC. </w:t>
+        <w:t xml:space="preserve">Config. </w:t>
       </w:r>
       <w:r>
-        <w:t>One Bicep/Terraform definition with per-env parameter files (dev/test/prod) — never hand-edit cloud resources.</w:t>
+        <w:t>One Helm chart with per-env values files (values-dev/test/prod.yaml); infra via Bicep/Terraform params.</w:t>
       </w:r>
     </w:p>
     <w:p>
@@ -2645,7 +2873,7 @@
         <w:t xml:space="preserve">Promotion. </w:t>
       </w:r>
       <w:r>
-        <w:t>The same image digest flows Dev → Test → Prod; only configuration differs. Prod deploys require manual approval.</w:t>
+        <w:t>The same image digest flows Dev → Test → Prod; only values differ. Prod requires manual approval.</w:t>
       </w:r>
     </w:p>
     <w:p>
@@ -2815,7 +3043,7 @@
               <w:rPr>
                 <w:sz w:val="18"/>
               </w:rPr>
-              <w:t>Container Apps replicas</w:t>
+              <w:t>AKS topology</w:t>
             </w:r>
           </w:p>
         </w:tc>
@@ -2829,7 +3057,7 @@
               <w:rPr>
                 <w:sz w:val="18"/>
               </w:rPr>
-              <w:t>0–2 (scale to zero)</w:t>
+              <w:t>Shared cluster, namespace</w:t>
             </w:r>
           </w:p>
         </w:tc>
@@ -2843,7 +3071,7 @@
               <w:rPr>
                 <w:sz w:val="18"/>
               </w:rPr>
-              <w:t>1–3</w:t>
+              <w:t>Shared cluster, namespace</w:t>
             </w:r>
           </w:p>
         </w:tc>
@@ -2857,7 +3085,65 @@
               <w:rPr>
                 <w:sz w:val="18"/>
               </w:rPr>
-              <w:t>2–10, zone-redundant</w:t>
+              <w:t>Dedicated cluster, multi-zone</w:t>
+            </w:r>
+          </w:p>
+        </w:tc>
+      </w:tr>
+      <w:tr>
+        <w:tc>
+          <w:tcPr>
+            <w:tcW w:type="dxa" w:w="2448"/>
+          </w:tcPr>
+          <w:p>
+            <w:r/>
+            <w:r>
+              <w:rPr>
+                <w:sz w:val="18"/>
+              </w:rPr>
+              <w:t>API replicas / HPA</w:t>
+            </w:r>
+          </w:p>
+        </w:tc>
+        <w:tc>
+          <w:tcPr>
+            <w:tcW w:type="dxa" w:w="2304"/>
+          </w:tcPr>
+          <w:p>
+            <w:r/>
+            <w:r>
+              <w:rPr>
+                <w:sz w:val="18"/>
+              </w:rPr>
+              <w:t>1, min 1</w:t>
+            </w:r>
+          </w:p>
+        </w:tc>
+        <w:tc>
+          <w:tcPr>
+            <w:tcW w:type="dxa" w:w="2304"/>
+          </w:tcPr>
+          <w:p>
+            <w:r/>
+            <w:r>
+              <w:rPr>
+                <w:sz w:val="18"/>
+              </w:rPr>
+              <w:t>2, 2–4</w:t>
+            </w:r>
+          </w:p>
+        </w:tc>
+        <w:tc>
+          <w:tcPr>
+            <w:tcW w:type="dxa" w:w="2736"/>
+          </w:tcPr>
+          <w:p>
+            <w:r/>
+            <w:r>
+              <w:rPr>
+                <w:sz w:val="18"/>
+              </w:rPr>
+              <w:t>3+, 3–10 across zones</w:t>
             </w:r>
           </w:p>
         </w:tc>
@@ -2901,7 +3187,7 @@
               <w:rPr>
                 <w:sz w:val="18"/>
               </w:rPr>
-              <w:t>Burstable/GP, no HA</w:t>
+              <w:t>Burstable/GP</w:t>
             </w:r>
           </w:p>
         </w:tc>
@@ -2989,7 +3275,7 @@
               <w:rPr>
                 <w:sz w:val="18"/>
               </w:rPr>
-              <w:t>Front Door WAF</w:t>
+              <w:t>Ingress WAF</w:t>
             </w:r>
           </w:p>
         </w:tc>
@@ -3047,7 +3333,7 @@
               <w:rPr>
                 <w:sz w:val="18"/>
               </w:rPr>
-              <w:t>Ingress</w:t>
+              <w:t>API server</w:t>
             </w:r>
           </w:p>
         </w:tc>
@@ -3061,7 +3347,7 @@
               <w:rPr>
                 <w:sz w:val="18"/>
               </w:rPr>
-              <w:t>Public host (optionally IP-restricted)</w:t>
+              <w:t>Authorized IP ranges</w:t>
             </w:r>
           </w:p>
         </w:tc>
@@ -3075,7 +3361,7 @@
               <w:rPr>
                 <w:sz w:val="18"/>
               </w:rPr>
-              <w:t>Private/internal</w:t>
+              <w:t>Private</w:t>
             </w:r>
           </w:p>
         </w:tc>
@@ -3089,7 +3375,7 @@
               <w:rPr>
                 <w:sz w:val="18"/>
               </w:rPr>
-              <w:t>Private behind WAF + custom domain</w:t>
+              <w:t>Private</w:t>
             </w:r>
           </w:p>
         </w:tc>
@@ -3280,7 +3566,7 @@
         <w:pStyle w:val="Heading1"/>
       </w:pPr>
       <w:r>
-        <w:t>10. CI/CD pipeline</w:t>
+        <w:t>10. Delivery — CI/CD &amp; GitOps</w:t>
       </w:r>
     </w:p>
     <w:p>
@@ -3289,47 +3575,35 @@
           <w:b w:val="0"/>
           <w:i w:val="0"/>
         </w:rPr>
-        <w:t>Recommended GitHub Actions flow (Azure DevOps equivalent works the same):</w:t>
+        <w:t>Two common patterns; pick one:</w:t>
       </w:r>
     </w:p>
     <w:p>
       <w:pPr>
-        <w:pStyle w:val="ListNumber"/>
+        <w:pStyle w:val="ListBullet"/>
       </w:pPr>
       <w:r>
-        <w:t>Build &amp; test the backend and frontend; run type checks.</w:t>
+        <w:rPr>
+          <w:b/>
+        </w:rPr>
+        <w:t xml:space="preserve">Push CI/CD. </w:t>
+      </w:r>
+      <w:r>
+        <w:t>GitHub Actions builds &amp; tests, `az acr build` pushes the image, then `helm upgrade` to the cluster (Azure login via OIDC federated credentials). Migration Job runs as a Helm pre-upgrade hook (Appendix E).</w:t>
       </w:r>
     </w:p>
     <w:p>
       <w:pPr>
-        <w:pStyle w:val="ListNumber"/>
+        <w:pStyle w:val="ListBullet"/>
       </w:pPr>
       <w:r>
-        <w:t>Build the backend container image and push to ACR tagged with the commit SHA.</w:t>
+        <w:rPr>
+          <w:b/>
+        </w:rPr>
+        <w:t xml:space="preserve">GitOps (recommended for prod). </w:t>
       </w:r>
-    </w:p>
-    <w:p>
-      <w:pPr>
-        <w:pStyle w:val="ListNumber"/>
-      </w:pPr>
       <w:r>
-        <w:t>Deploy to Dev (OIDC federated credentials — no stored cloud secret), running `prisma migrate deploy` as a pre-step.</w:t>
-      </w:r>
-    </w:p>
-    <w:p>
-      <w:pPr>
-        <w:pStyle w:val="ListNumber"/>
-      </w:pPr>
-      <w:r>
-        <w:t>Run smoke tests against Dev (e.g. GET /api/health, a login + catalog check).</w:t>
-      </w:r>
-    </w:p>
-    <w:p>
-      <w:pPr>
-        <w:pStyle w:val="ListNumber"/>
-      </w:pPr>
-      <w:r>
-        <w:t>Promote the same image to Test automatically; to Prod behind a required reviewer approval (GitHub Environments).</w:t>
+        <w:t>CI builds the image and bumps the digest in an environment overlay/values; Argo CD or Flux reconciles the cluster to Git. Promotion = a PR from dev → test → prod overlays with required reviewers.</w:t>
       </w:r>
     </w:p>
     <w:p>
@@ -3338,7 +3612,7 @@
           <w:b w:val="0"/>
           <w:i w:val="0"/>
         </w:rPr>
-        <w:t>Use GitHub Environments (dev/test/prod) for per-environment secrets/variables and protection rules. See Appendix D.</w:t>
+        <w:t>Use GitHub Environments (dev/test/prod) for per-environment variables and protection rules. Never run privileged kubectl from laptops against prod — drive changes through the pipeline / GitOps.</w:t>
       </w:r>
     </w:p>
     <w:p>
@@ -3362,10 +3636,24 @@
         <w:rPr>
           <w:b/>
         </w:rPr>
-        <w:t xml:space="preserve">Telemetry. </w:t>
+        <w:t xml:space="preserve">Cluster. </w:t>
       </w:r>
       <w:r>
-        <w:t>Application Insights for the API (requests, dependencies, exceptions); Container Apps logs → Log Analytics.</w:t>
+        <w:t>Container Insights → Log Analytics (node/pod metrics, container logs); Prometheus metrics + managed Grafana optional.</w:t>
+      </w:r>
+    </w:p>
+    <w:p>
+      <w:pPr>
+        <w:pStyle w:val="ListBullet"/>
+      </w:pPr>
+      <w:r>
+        <w:rPr>
+          <w:b/>
+        </w:rPr>
+        <w:t xml:space="preserve">App. </w:t>
+      </w:r>
+      <w:r>
+        <w:t>Application Insights for requests, dependencies, exceptions, traces.</w:t>
       </w:r>
     </w:p>
     <w:p>
@@ -3379,21 +3667,7 @@
         <w:t xml:space="preserve">Alerts. </w:t>
       </w:r>
       <w:r>
-        <w:t>5xx rate, p95 latency, container restarts, PostgreSQL CPU/storage/connections, Azure OpenAI throttling (429).</w:t>
-      </w:r>
-    </w:p>
-    <w:p>
-      <w:pPr>
-        <w:pStyle w:val="ListBullet"/>
-      </w:pPr>
-      <w:r>
-        <w:rPr>
-          <w:b/>
-        </w:rPr>
-        <w:t xml:space="preserve">Dashboards. </w:t>
-      </w:r>
-      <w:r>
-        <w:t>An Azure Workbook per environment for golden signals and AI usage/cost.</w:t>
+        <w:t>5xx rate, p95 latency, pod restarts/CrashLoopBackOff, HPA saturation, node pressure, PostgreSQL CPU/storage/connections, Azure OpenAI 429s.</w:t>
       </w:r>
     </w:p>
     <w:p>
@@ -3407,7 +3681,7 @@
         <w:t xml:space="preserve">Backup/DR. </w:t>
       </w:r>
       <w:r>
-        <w:t>PostgreSQL PITR + geo-redundant backups in Prod; IaC enables full rebuild; document RPO/RTO targets.</w:t>
+        <w:t>PostgreSQL PITR + geo-redundant backups (Prod); IaC + Helm enable full rebuild; Velero for cluster state if needed; document RPO/RTO.</w:t>
       </w:r>
     </w:p>
     <w:p>
@@ -3421,7 +3695,7 @@
         <w:t xml:space="preserve">Cost. </w:t>
       </w:r>
       <w:r>
-        <w:t>Budgets + alerts per resource group; scale Dev to zero off-hours.</w:t>
+        <w:t>Budgets + alerts per RG; cluster autoscaler + scale-down; scale Dev to minimum off-hours.</w:t>
       </w:r>
     </w:p>
     <w:p>
@@ -3443,7 +3717,7 @@
           <w:b w:val="0"/>
           <w:i w:val="0"/>
         </w:rPr>
-        <w:t>High-level order (drive via IaC; az CLI shown for clarity). Repeat per environment with its parameters.</w:t>
+        <w:t>Drive via IaC + Helm; az CLI shown for clarity. Repeat per environment with its parameters.</w:t>
       </w:r>
     </w:p>
     <w:p>
@@ -3459,7 +3733,7 @@
         <w:pStyle w:val="ListNumber"/>
       </w:pPr>
       <w:r>
-        <w:t>Virtual network and subnets (per §5.1); NSGs.</w:t>
+        <w:t>VNet &amp; subnets (per §5.1); NSGs; route table (UDR → firewall).</w:t>
       </w:r>
     </w:p>
     <w:p>
@@ -3467,7 +3741,7 @@
         <w:pStyle w:val="ListNumber"/>
       </w:pPr>
       <w:r>
-        <w:t>Private DNS zones (per §5.2) and link to the VNet.</w:t>
+        <w:t>Private DNS zones (per §5.3) linked to the VNet.</w:t>
       </w:r>
     </w:p>
     <w:p>
@@ -3475,7 +3749,7 @@
         <w:pStyle w:val="ListNumber"/>
       </w:pPr>
       <w:r>
-        <w:t>Key Vault (RBAC, private endpoint) and seed secrets.</w:t>
+        <w:t>Key Vault (RBAC, private endpoint) + seed secrets.</w:t>
       </w:r>
     </w:p>
     <w:p>
@@ -3483,7 +3757,7 @@
         <w:pStyle w:val="ListNumber"/>
       </w:pPr>
       <w:r>
-        <w:t>Azure Container Registry (private endpoint).</w:t>
+        <w:t>ACR (private endpoint).</w:t>
       </w:r>
     </w:p>
     <w:p>
@@ -3491,7 +3765,7 @@
         <w:pStyle w:val="ListNumber"/>
       </w:pPr>
       <w:r>
-        <w:t>PostgreSQL Flexible Server (VNet-integrated, private) + application role/database.</w:t>
+        <w:t>PostgreSQL Flexible Server (private) + app role/database.</w:t>
       </w:r>
     </w:p>
     <w:p>
@@ -3499,7 +3773,7 @@
         <w:pStyle w:val="ListNumber"/>
       </w:pPr>
       <w:r>
-        <w:t>Azure OpenAI resource + model deployment (private endpoint).</w:t>
+        <w:t>Azure OpenAI + model deployment (private endpoint).</w:t>
       </w:r>
     </w:p>
     <w:p>
@@ -3507,7 +3781,7 @@
         <w:pStyle w:val="ListNumber"/>
       </w:pPr>
       <w:r>
-        <w:t>User-assigned managed identity + role assignments (per §3.2).</w:t>
+        <w:t>Azure Firewall (+ UDR) or NAT Gateway for egress.</w:t>
       </w:r>
     </w:p>
     <w:p>
@@ -3515,7 +3789,7 @@
         <w:pStyle w:val="ListNumber"/>
       </w:pPr>
       <w:r>
-        <w:t>Container Apps environment (VNet-injected) + the API container app with Key Vault references.</w:t>
+        <w:t>AKS cluster (private, Azure CNI Overlay, OIDC + Workload Identity, addons: CSI, AGIC, monitoring); attach ACR.</w:t>
       </w:r>
     </w:p>
     <w:p>
@@ -3523,7 +3797,7 @@
         <w:pStyle w:val="ListNumber"/>
       </w:pPr>
       <w:r>
-        <w:t>Front end hosting (Static Web App / Blob static site).</w:t>
+        <w:t>Workload identity: user-assigned MI + federated credential + role assignments (§3.2).</w:t>
       </w:r>
     </w:p>
     <w:p>
@@ -3531,7 +3805,7 @@
         <w:pStyle w:val="ListNumber"/>
       </w:pPr>
       <w:r>
-        <w:t>Front Door + WAF: origins (front end, API via Private Link), routes (/ and /api/*), custom domain + TLS.</w:t>
+        <w:t>App Gateway (WAF_v2) for AGIC; custom domain + TLS cert (Key Vault or cert-manager).</w:t>
       </w:r>
     </w:p>
     <w:p>
@@ -3539,7 +3813,7 @@
         <w:pStyle w:val="ListNumber"/>
       </w:pPr>
       <w:r>
-        <w:t>Azure Firewall / NAT Gateway + egress rules; finalize NSGs.</w:t>
+        <w:t>Entra app registration redirect URI for this environment.</w:t>
       </w:r>
     </w:p>
     <w:p>
@@ -3547,7 +3821,7 @@
         <w:pStyle w:val="ListNumber"/>
       </w:pPr>
       <w:r>
-        <w:t>Entra app registration redirect URI for this environment; run DB migrations; deploy image; smoke test.</w:t>
+        <w:t>helm upgrade --install (runs migration Job, deploys API + front end, Service, Ingress, HPA); smoke test.</w:t>
       </w:r>
     </w:p>
     <w:p>
@@ -3560,33 +3834,35 @@
           <w:rFonts w:ascii="Consolas" w:hAnsi="Consolas"/>
           <w:sz w:val="17"/>
         </w:rPr>
-        <w:t># Illustrative — prefer Bicep/Terraform for repeatability</w:t>
+        <w:t># Illustrative — prefer Bicep/Terraform + Helm</w:t>
         <w:br/>
-        <w:t>az group create -n rg-uifactory-prod -l westeurope</w:t>
+        <w:t>az aks create -g rg-uifactory-prod -n aks-uifactory-prod \</w:t>
         <w:br/>
-        <w:t>az network vnet create -g rg-uifactory-prod -n vnet-uifactory-prod \</w:t>
+        <w:t xml:space="preserve">  --network-plugin azure --network-plugin-mode overlay --network-policy cilium \</w:t>
         <w:br/>
-        <w:t xml:space="preserve">  --address-prefixes 10.20.0.0/16 --subnet-name snet-aca --subnet-prefixes 10.20.0.0/23</w:t>
+        <w:t xml:space="preserve">  --enable-private-cluster --enable-oidc-issuer --enable-workload-identity \</w:t>
         <w:br/>
-        <w:t>az keyvault create -g rg-uifactory-prod -n kv-uifactory-prod --enable-rbac-authorization true</w:t>
+        <w:t xml:space="preserve">  --enable-addons azure-keyvault-secrets-provider,ingress-appgw,monitoring \</w:t>
         <w:br/>
-        <w:t>az postgres flexible-server create -g rg-uifactory-prod -n pg-uifactory-prod \</w:t>
+        <w:t xml:space="preserve">  --appgw-name agw-uifactory-prod --appgw-subnet-id &lt;snet-agw-id&gt; \</w:t>
         <w:br/>
-        <w:t xml:space="preserve">  --tier GeneralPurpose --high-availability ZoneRedundant --public-access Disabled</w:t>
+        <w:t xml:space="preserve">  --outbound-type userDefinedRouting --enable-cluster-autoscaler --min-count 3 --max-count 10</w:t>
         <w:br/>
-        <w:t>az containerapp env create -g rg-uifactory-prod -n cae-uifactory-prod \</w:t>
+        <w:t>az aks update -g rg-uifactory-prod -n aks-uifactory-prod --attach-acr &lt;acrName&gt;</w:t>
         <w:br/>
-        <w:t xml:space="preserve">  --infrastructure-subnet-resource-id &lt;snet-aca-id&gt; --internal-only true</w:t>
+        <w:t># workload identity federation</w:t>
         <w:br/>
-        <w:t>az containerapp create -g rg-uifactory-prod -n ca-uifactory-prod \</w:t>
+        <w:t>az identity federated-credential create --name uifactory --identity-name id-uifactory-prod \</w:t>
         <w:br/>
-        <w:t xml:space="preserve">  --environment cae-uifactory-prod --image &lt;acr&gt;.azurecr.io/uifactory-api:&lt;sha&gt; \</w:t>
+        <w:t xml:space="preserve">  -g rg-uifactory-prod --issuer $(az aks show -g rg-uifactory-prod -n aks-uifactory-prod \</w:t>
         <w:br/>
-        <w:t xml:space="preserve">  --target-port 3001 --ingress internal --user-assigned &lt;mi-id&gt; \</w:t>
+        <w:t xml:space="preserve">  --query oidcIssuerProfile.issuerUrl -o tsv) --subject system:serviceaccount:uifactory:uifactory-api</w:t>
         <w:br/>
-        <w:t xml:space="preserve">  --secrets database-url=keyvaultref:&lt;kv-secret-uri&gt;,identityref:&lt;mi-id&gt; \</w:t>
+        <w:t>az aks get-credentials -g rg-uifactory-prod -n aks-uifactory-prod</w:t>
         <w:br/>
-        <w:t xml:space="preserve">  --env-vars NODE_ENV=production PORT=3001 DATABASE_URL=secretref:database-url</w:t>
+        <w:t>helm upgrade --install uifactory ./charts/uifactory -n uifactory --create-namespace \</w:t>
+        <w:br/>
+        <w:t xml:space="preserve">  -f charts/uifactory/values-prod.yaml --set image.tag=$GIT_SHA</w:t>
       </w:r>
     </w:p>
     <w:p>
@@ -3607,6 +3883,14 @@
         <w:pStyle w:val="ListBullet"/>
       </w:pPr>
       <w:r>
+        <w:t>Private API server (or authorized IP ranges); Azure RBAC for Kubernetes + Entra admin groups.</w:t>
+      </w:r>
+    </w:p>
+    <w:p>
+      <w:pPr>
+        <w:pStyle w:val="ListBullet"/>
+      </w:pPr>
+      <w:r>
         <w:t>Public access disabled on PostgreSQL, Key Vault, ACR, Azure OpenAI (Private Endpoints only).</w:t>
       </w:r>
     </w:p>
@@ -3615,7 +3899,7 @@
         <w:pStyle w:val="ListBullet"/>
       </w:pPr>
       <w:r>
-        <w:t>All secrets in Key Vault; none in images, pipelines, or app settings as plaintext.</w:t>
+        <w:t>Workload Identity for pod→Azure auth; no static cloud secrets in the cluster.</w:t>
       </w:r>
     </w:p>
     <w:p>
@@ -3623,7 +3907,7 @@
         <w:pStyle w:val="ListBullet"/>
       </w:pPr>
       <w:r>
-        <w:t>Unique JWT_SECRET and SECRETS_KEY per environment; rotation procedure documented.</w:t>
+        <w:t>Secrets only via Key Vault + CSI; unique JWT_SECRET and SECRETS_KEY per environment with rotation.</w:t>
       </w:r>
     </w:p>
     <w:p>
@@ -3631,7 +3915,7 @@
         <w:pStyle w:val="ListBullet"/>
       </w:pPr>
       <w:r>
-        <w:t>Front Door WAF in Prevention mode for Prod; custom domain with managed TLS.</w:t>
+        <w:t>Network policy default-deny + explicit allows; egress restricted via firewall FQDN rules.</w:t>
       </w:r>
     </w:p>
     <w:p>
@@ -3639,7 +3923,7 @@
         <w:pStyle w:val="ListBullet"/>
       </w:pPr>
       <w:r>
-        <w:t>Managed identity with least-privilege RBAC; no admin DB credentials in the app.</w:t>
+        <w:t>Ingress WAF in Prevention for Prod; TLS via Key Vault/cert-manager; custom domain.</w:t>
       </w:r>
     </w:p>
     <w:p>
@@ -3647,7 +3931,7 @@
         <w:pStyle w:val="ListBullet"/>
       </w:pPr>
       <w:r>
-        <w:t>Egress restricted (firewall FQDN rules / NAT); SSRF private-IP blocking enabled in Prod.</w:t>
+        <w:t>Image scanning (Defender for Containers / ACR), non-root containers, Azure Policy for AKS baseline.</w:t>
       </w:r>
     </w:p>
     <w:p>
@@ -3655,7 +3939,7 @@
         <w:pStyle w:val="ListBullet"/>
       </w:pPr>
       <w:r>
-        <w:t>Microsoft Graph admin consent limited to User.Read.All; review periodically.</w:t>
+        <w:t>SSRF private-IP blocking enabled in Prod; Graph consent limited to User.Read.All and reviewed.</w:t>
       </w:r>
     </w:p>
     <w:p>
@@ -3663,7 +3947,7 @@
         <w:pStyle w:val="ListBullet"/>
       </w:pPr>
       <w:r>
-        <w:t>Diagnostic logs and alerts enabled; budgets configured.</w:t>
+        <w:t>Container Insights + App Insights + alerts enabled; budgets configured.</w:t>
       </w:r>
     </w:p>
     <w:p>
@@ -3689,8 +3973,6 @@
           <w:rFonts w:ascii="Consolas" w:hAnsi="Consolas"/>
           <w:sz w:val="17"/>
         </w:rPr>
-        <w:t># build stage</w:t>
-        <w:br/>
         <w:t>FROM node:22-alpine AS build</w:t>
         <w:br/>
         <w:t>WORKDIR /app</w:t>
@@ -3709,8 +3991,6 @@
         <w:br/>
         <w:t/>
         <w:br/>
-        <w:t># runtime stage</w:t>
-        <w:br/>
         <w:t>FROM node:22-alpine AS runtime</w:t>
         <w:br/>
         <w:t>WORKDIR /app</w:t>
@@ -3723,11 +4003,11 @@
         <w:br/>
         <w:t>COPY --from=build /app/backend/prisma ./backend/prisma</w:t>
         <w:br/>
+        <w:t>USER node</w:t>
+        <w:br/>
         <w:t>EXPOSE 3001</w:t>
         <w:br/>
-        <w:t># run migrations then start (or run migrate as a separate pipeline step)</w:t>
-        <w:br/>
-        <w:t>CMD ["sh","-c","npx prisma migrate deploy --schema backend/prisma/schema.prisma &amp;&amp; node backend/dist/main.js"]</w:t>
+        <w:t>CMD ["node","backend/dist/main.js"]   # migrations run as a separate Job (Appendix D)</w:t>
       </w:r>
     </w:p>
     <w:p>
@@ -3735,16 +4015,7 @@
         <w:pStyle w:val="Heading1"/>
       </w:pPr>
       <w:r>
-        <w:t>Appendix B — Front end hosting</w:t>
-      </w:r>
-    </w:p>
-    <w:p>
-      <w:r>
-        <w:rPr>
-          <w:b w:val="0"/>
-          <w:i w:val="0"/>
-        </w:rPr>
-        <w:t>Build the SPA and publish the static output; route it through the same Front Door as the API.</w:t>
+        <w:t>Appendix B — Front end image (sample)</w:t>
       </w:r>
     </w:p>
     <w:p>
@@ -3757,13 +4028,29 @@
           <w:rFonts w:ascii="Consolas" w:hAnsi="Consolas"/>
           <w:sz w:val="17"/>
         </w:rPr>
-        <w:t>npm run build --workspace frontend   # outputs frontend/dist</w:t>
+        <w:t>FROM node:22-alpine AS build</w:t>
         <w:br/>
-        <w:t># Option 1: Azure Static Web Apps (deploy frontend/dist) — Front Door route '/'</w:t>
+        <w:t>WORKDIR /app</w:t>
         <w:br/>
-        <w:t># Option 2: Blob static website + Front Door origin</w:t>
+        <w:t>COPY package*.json ./</w:t>
         <w:br/>
-        <w:t># Front Door routes:  '/' -&gt; frontend origin,  '/api/*' -&gt; Container App (Private Link)</w:t>
+        <w:t>COPY frontend/package*.json frontend/</w:t>
+        <w:br/>
+        <w:t>RUN npm ci</w:t>
+        <w:br/>
+        <w:t>COPY . .</w:t>
+        <w:br/>
+        <w:t>RUN npm run build --workspace frontend</w:t>
+        <w:br/>
+        <w:t/>
+        <w:br/>
+        <w:t>FROM nginx:alpine</w:t>
+        <w:br/>
+        <w:t>COPY --from=build /app/frontend/dist /usr/share/nginx/html</w:t>
+        <w:br/>
+        <w:t># SPA fallback: try_files $uri /index.html;  (provide nginx.conf)</w:t>
+        <w:br/>
+        <w:t># Alternatively skip this image and host frontend/dist on Azure Static Web Apps.</w:t>
       </w:r>
     </w:p>
     <w:p>
@@ -3771,71 +4058,132 @@
         <w:pStyle w:val="Heading1"/>
       </w:pPr>
       <w:r>
-        <w:t>Appendix C — Bicep module checklist</w:t>
+        <w:t>Appendix C — Workloads: ServiceAccount, SecretProviderClass, Ingress (sketch)</w:t>
       </w:r>
     </w:p>
     <w:p>
       <w:pPr>
-        <w:pStyle w:val="ListBullet"/>
+        <w:spacing w:before="40" w:after="120"/>
+        <w:shd w:val="clear" w:fill="F2F3F5"/>
       </w:pPr>
       <w:r>
-        <w:t>network.bicep — VNet, subnets, NSGs, private DNS zones + links</w:t>
-      </w:r>
-    </w:p>
-    <w:p>
-      <w:pPr>
-        <w:pStyle w:val="ListBullet"/>
-      </w:pPr>
-      <w:r>
-        <w:t>data.bicep — PostgreSQL Flexible Server + private endpoint</w:t>
-      </w:r>
-    </w:p>
-    <w:p>
-      <w:pPr>
-        <w:pStyle w:val="ListBullet"/>
-      </w:pPr>
-      <w:r>
-        <w:t>secrets.bicep — Key Vault + secrets + access (RBAC)</w:t>
-      </w:r>
-    </w:p>
-    <w:p>
-      <w:pPr>
-        <w:pStyle w:val="ListBullet"/>
-      </w:pPr>
-      <w:r>
-        <w:t>ai.bicep — Azure OpenAI + deployment + private endpoint</w:t>
-      </w:r>
-    </w:p>
-    <w:p>
-      <w:pPr>
-        <w:pStyle w:val="ListBullet"/>
-      </w:pPr>
-      <w:r>
-        <w:t>registry.bicep — ACR + private endpoint</w:t>
-      </w:r>
-    </w:p>
-    <w:p>
-      <w:pPr>
-        <w:pStyle w:val="ListBullet"/>
-      </w:pPr>
-      <w:r>
-        <w:t>compute.bicep — managed identity, Container Apps env + app, role assignments</w:t>
-      </w:r>
-    </w:p>
-    <w:p>
-      <w:pPr>
-        <w:pStyle w:val="ListBullet"/>
-      </w:pPr>
-      <w:r>
-        <w:t>edge.bicep — Front Door + WAF + routes + custom domain; Firewall/NAT</w:t>
-      </w:r>
-    </w:p>
-    <w:p>
-      <w:pPr>
-        <w:pStyle w:val="ListBullet"/>
-      </w:pPr>
-      <w:r>
-        <w:t>main.bicep — composes modules; dev.bicepparam / test.bicepparam / prod.bicepparam</w:t>
+        <w:rPr>
+          <w:rFonts w:ascii="Consolas" w:hAnsi="Consolas"/>
+          <w:sz w:val="17"/>
+        </w:rPr>
+        <w:t>apiVersion: v1</w:t>
+        <w:br/>
+        <w:t>kind: ServiceAccount</w:t>
+        <w:br/>
+        <w:t>metadata:</w:t>
+        <w:br/>
+        <w:t xml:space="preserve">  name: uifactory-api</w:t>
+        <w:br/>
+        <w:t xml:space="preserve">  namespace: uifactory</w:t>
+        <w:br/>
+        <w:t xml:space="preserve">  annotations:</w:t>
+        <w:br/>
+        <w:t xml:space="preserve">    azure.workload.identity/client-id: &lt;managed-identity-client-id&gt;</w:t>
+        <w:br/>
+        <w:t>---</w:t>
+        <w:br/>
+        <w:t>apiVersion: secrets-store.csi.x-k8s.io/v1</w:t>
+        <w:br/>
+        <w:t>kind: SecretProviderClass</w:t>
+        <w:br/>
+        <w:t>metadata:</w:t>
+        <w:br/>
+        <w:t xml:space="preserve">  name: uifactory-kv</w:t>
+        <w:br/>
+        <w:t xml:space="preserve">  namespace: uifactory</w:t>
+        <w:br/>
+        <w:t>spec:</w:t>
+        <w:br/>
+        <w:t xml:space="preserve">  provider: azure</w:t>
+        <w:br/>
+        <w:t xml:space="preserve">  parameters:</w:t>
+        <w:br/>
+        <w:t xml:space="preserve">    usePodIdentity: "false"</w:t>
+        <w:br/>
+        <w:t xml:space="preserve">    clientID: &lt;managed-identity-client-id&gt;</w:t>
+        <w:br/>
+        <w:t xml:space="preserve">    keyvaultName: kv-uifactory-prod</w:t>
+        <w:br/>
+        <w:t xml:space="preserve">    tenantId: &lt;tenant-id&gt;</w:t>
+        <w:br/>
+        <w:t xml:space="preserve">    objects: |</w:t>
+        <w:br/>
+        <w:t xml:space="preserve">      array:</w:t>
+        <w:br/>
+        <w:t xml:space="preserve">        - |</w:t>
+        <w:br/>
+        <w:t xml:space="preserve">          objectName: DATABASE-URL</w:t>
+        <w:br/>
+        <w:t xml:space="preserve">          objectType: secret</w:t>
+        <w:br/>
+        <w:t xml:space="preserve">  secretObjects:</w:t>
+        <w:br/>
+        <w:t xml:space="preserve">    - secretName: uifactory-secrets</w:t>
+        <w:br/>
+        <w:t xml:space="preserve">      type: Opaque</w:t>
+        <w:br/>
+        <w:t xml:space="preserve">      data:</w:t>
+        <w:br/>
+        <w:t xml:space="preserve">        - objectName: DATABASE-URL</w:t>
+        <w:br/>
+        <w:t xml:space="preserve">          key: DATABASE_URL</w:t>
+        <w:br/>
+        <w:t>---</w:t>
+        <w:br/>
+        <w:t>apiVersion: networking.k8s.io/v1</w:t>
+        <w:br/>
+        <w:t>kind: Ingress</w:t>
+        <w:br/>
+        <w:t>metadata:</w:t>
+        <w:br/>
+        <w:t xml:space="preserve">  name: uifactory</w:t>
+        <w:br/>
+        <w:t xml:space="preserve">  namespace: uifactory</w:t>
+        <w:br/>
+        <w:t xml:space="preserve">  annotations:</w:t>
+        <w:br/>
+        <w:t xml:space="preserve">    kubernetes.io/ingress.class: azure/application-gateway</w:t>
+        <w:br/>
+        <w:t xml:space="preserve">    appgw.ingress.kubernetes.io/waf-policy-for-path: &lt;waf-policy-id&gt;</w:t>
+        <w:br/>
+        <w:t>spec:</w:t>
+        <w:br/>
+        <w:t xml:space="preserve">  rules:</w:t>
+        <w:br/>
+        <w:t xml:space="preserve">    - host: uifactory.contoso.com</w:t>
+        <w:br/>
+        <w:t xml:space="preserve">      http:</w:t>
+        <w:br/>
+        <w:t xml:space="preserve">        paths:</w:t>
+        <w:br/>
+        <w:t xml:space="preserve">          - path: /api</w:t>
+        <w:br/>
+        <w:t xml:space="preserve">            pathType: Prefix</w:t>
+        <w:br/>
+        <w:t xml:space="preserve">            backend:</w:t>
+        <w:br/>
+        <w:t xml:space="preserve">              service:</w:t>
+        <w:br/>
+        <w:t xml:space="preserve">                name: uifactory-api</w:t>
+        <w:br/>
+        <w:t xml:space="preserve">                port: { number: 80 }</w:t>
+        <w:br/>
+        <w:t xml:space="preserve">          - path: /</w:t>
+        <w:br/>
+        <w:t xml:space="preserve">            pathType: Prefix</w:t>
+        <w:br/>
+        <w:t xml:space="preserve">            backend:</w:t>
+        <w:br/>
+        <w:t xml:space="preserve">              service:</w:t>
+        <w:br/>
+        <w:t xml:space="preserve">                name: uifactory-frontend</w:t>
+        <w:br/>
+        <w:t xml:space="preserve">                port: { number: 80 }</w:t>
       </w:r>
     </w:p>
     <w:p>
@@ -3843,7 +4191,68 @@
         <w:pStyle w:val="Heading1"/>
       </w:pPr>
       <w:r>
-        <w:t>Appendix D — GitHub Actions (sketch)</w:t>
+        <w:t>Appendix D — Migration Job (Helm pre-upgrade hook)</w:t>
+      </w:r>
+    </w:p>
+    <w:p>
+      <w:pPr>
+        <w:spacing w:before="40" w:after="120"/>
+        <w:shd w:val="clear" w:fill="F2F3F5"/>
+      </w:pPr>
+      <w:r>
+        <w:rPr>
+          <w:rFonts w:ascii="Consolas" w:hAnsi="Consolas"/>
+          <w:sz w:val="17"/>
+        </w:rPr>
+        <w:t>apiVersion: batch/v1</w:t>
+        <w:br/>
+        <w:t>kind: Job</w:t>
+        <w:br/>
+        <w:t>metadata:</w:t>
+        <w:br/>
+        <w:t xml:space="preserve">  name: uifactory-migrate</w:t>
+        <w:br/>
+        <w:t xml:space="preserve">  namespace: uifactory</w:t>
+        <w:br/>
+        <w:t xml:space="preserve">  annotations:</w:t>
+        <w:br/>
+        <w:t xml:space="preserve">    "helm.sh/hook": pre-install,pre-upgrade</w:t>
+        <w:br/>
+        <w:t xml:space="preserve">    "helm.sh/hook-delete-policy": before-hook-creation,hook-succeeded</w:t>
+        <w:br/>
+        <w:t>spec:</w:t>
+        <w:br/>
+        <w:t xml:space="preserve">  template:</w:t>
+        <w:br/>
+        <w:t xml:space="preserve">    metadata:</w:t>
+        <w:br/>
+        <w:t xml:space="preserve">      labels: { azure.workload.identity/use: "true" }</w:t>
+        <w:br/>
+        <w:t xml:space="preserve">    spec:</w:t>
+        <w:br/>
+        <w:t xml:space="preserve">      serviceAccountName: uifactory-api</w:t>
+        <w:br/>
+        <w:t xml:space="preserve">      restartPolicy: Never</w:t>
+        <w:br/>
+        <w:t xml:space="preserve">      containers:</w:t>
+        <w:br/>
+        <w:t xml:space="preserve">        - name: migrate</w:t>
+        <w:br/>
+        <w:t xml:space="preserve">          image: &lt;acr&gt;.azurecr.io/uifactory-api:{{ .Values.image.tag }}</w:t>
+        <w:br/>
+        <w:t xml:space="preserve">          command: ["npx","prisma","migrate","deploy","--schema","backend/prisma/schema.prisma"]</w:t>
+        <w:br/>
+        <w:t xml:space="preserve">          envFrom:</w:t>
+        <w:br/>
+        <w:t xml:space="preserve">            - secretRef: { name: uifactory-secrets }</w:t>
+      </w:r>
+    </w:p>
+    <w:p>
+      <w:pPr>
+        <w:pStyle w:val="Heading1"/>
+      </w:pPr>
+      <w:r>
+        <w:t>Appendix E — GitHub Actions (Helm deploy, sketch)</w:t>
       </w:r>
     </w:p>
     <w:p>
@@ -3864,17 +4273,17 @@
         <w:br/>
         <w:t>jobs:</w:t>
         <w:br/>
-        <w:t xml:space="preserve">  build:</w:t>
+        <w:t xml:space="preserve">  release:</w:t>
         <w:br/>
         <w:t xml:space="preserve">    runs-on: ubuntu-latest</w:t>
+        <w:br/>
+        <w:t xml:space="preserve">    environment: prod        # requires reviewer approval</w:t>
         <w:br/>
         <w:t xml:space="preserve">    steps:</w:t>
         <w:br/>
         <w:t xml:space="preserve">      - uses: actions/checkout@v4</w:t>
         <w:br/>
-        <w:t xml:space="preserve">      - run: npm ci &amp;&amp; npm run build</w:t>
-        <w:br/>
-        <w:t xml:space="preserve">      - uses: azure/login@v2          # OIDC federated credentials</w:t>
+        <w:t xml:space="preserve">      - uses: azure/login@v2        # OIDC federated credentials</w:t>
         <w:br/>
         <w:t xml:space="preserve">        with: { client-id: ${{ secrets.AZURE_CLIENT_ID }},</w:t>
         <w:br/>
@@ -3884,19 +4293,13 @@
         <w:br/>
         <w:t xml:space="preserve">      - run: az acr build -r $ACR -t uifactory-api:${{ github.sha }} -f Dockerfile .</w:t>
         <w:br/>
-        <w:t xml:space="preserve">  deploy-prod:</w:t>
+        <w:t xml:space="preserve">      - run: az aks get-credentials -g rg-uifactory-prod -n aks-uifactory-prod</w:t>
         <w:br/>
-        <w:t xml:space="preserve">    needs: build</w:t>
+        <w:t xml:space="preserve">      - run: |</w:t>
         <w:br/>
-        <w:t xml:space="preserve">    environment: prod                 # requires reviewer approval</w:t>
+        <w:t xml:space="preserve">          helm upgrade --install uifactory ./charts/uifactory -n uifactory --create-namespace \</w:t>
         <w:br/>
-        <w:t xml:space="preserve">    runs-on: ubuntu-latest</w:t>
-        <w:br/>
-        <w:t xml:space="preserve">    steps:</w:t>
-        <w:br/>
-        <w:t xml:space="preserve">      - run: az containerapp update -n ca-uifactory-prod -g rg-uifactory-prod \</w:t>
-        <w:br/>
-        <w:t xml:space="preserve">             --image $ACR.azurecr.io/uifactory-api:${{ github.sha }}</w:t>
+        <w:t xml:space="preserve">            -f charts/uifactory/values-prod.yaml --set image.tag=${{ github.sha }} --wait</w:t>
       </w:r>
     </w:p>
     <w:p>
@@ -3904,7 +4307,7 @@
         <w:pStyle w:val="Heading1"/>
       </w:pPr>
       <w:r>
-        <w:t>Appendix E — Environment variable reference</w:t>
+        <w:t>Appendix F — Environment variable reference</w:t>
       </w:r>
     </w:p>
     <w:tbl>
@@ -4042,7 +4445,7 @@
               <w:rPr>
                 <w:sz w:val="18"/>
               </w:rPr>
-              <w:t>Public origin; used for CORS + OIDC redirects</w:t>
+              <w:t>Public origin; CORS + OIDC redirects</w:t>
             </w:r>
           </w:p>
         </w:tc>

</xml_diff>

<commit_message>
Embed architecture and network diagrams in the AKS deployment manual
Render the solution architecture and per-environment network topology as
images (Mermaid) and embed them in §1.2 and §5 of the manual.

https://claude.ai/code/session_01PRGcYxMGt9vC6d1FPpjhaQ
</commit_message>
<xml_diff>
--- a/docs/UIFactory-Azure-Deployment-Manual.docx
+++ b/docs/UIFactory-Azure-Deployment-Manual.docx
@@ -784,54 +784,59 @@
         <w:pStyle w:val="Heading2"/>
       </w:pPr>
       <w:r>
-        <w:t>1.2 Reference topology (Mermaid — render in any Mermaid viewer)</w:t>
+        <w:t>1.2 Reference architecture</w:t>
       </w:r>
     </w:p>
     <w:p>
       <w:pPr>
-        <w:spacing w:before="40" w:after="120"/>
-        <w:shd w:val="clear" w:fill="F2F3F5"/>
+        <w:jc w:val="center"/>
+      </w:pPr>
+      <w:r>
+        <w:drawing>
+          <wp:inline xmlns:a="http://schemas.openxmlformats.org/drawingml/2006/main" xmlns:pic="http://schemas.openxmlformats.org/drawingml/2006/picture">
+            <wp:extent cx="5943600" cy="2524240"/>
+            <wp:docPr id="1" name="Picture 1"/>
+            <wp:cNvGraphicFramePr>
+              <a:graphicFrameLocks noChangeAspect="1"/>
+            </wp:cNvGraphicFramePr>
+            <a:graphic>
+              <a:graphicData uri="http://schemas.openxmlformats.org/drawingml/2006/picture">
+                <pic:pic>
+                  <pic:nvPicPr>
+                    <pic:cNvPr id="0" name="architecture.png"/>
+                    <pic:cNvPicPr/>
+                  </pic:nvPicPr>
+                  <pic:blipFill>
+                    <a:blip r:embed="rId9"/>
+                    <a:stretch>
+                      <a:fillRect/>
+                    </a:stretch>
+                  </pic:blipFill>
+                  <pic:spPr>
+                    <a:xfrm>
+                      <a:off x="0" y="0"/>
+                      <a:ext cx="5943600" cy="2524240"/>
+                    </a:xfrm>
+                    <a:prstGeom prst="rect"/>
+                  </pic:spPr>
+                </pic:pic>
+              </a:graphicData>
+            </a:graphic>
+          </wp:inline>
+        </w:drawing>
+      </w:r>
+    </w:p>
+    <w:p>
+      <w:pPr>
+        <w:jc w:val="center"/>
       </w:pPr>
       <w:r>
         <w:rPr>
-          <w:rFonts w:ascii="Consolas" w:hAnsi="Consolas"/>
-          <w:sz w:val="17"/>
+          <w:i/>
+          <w:color w:val="6B7785"/>
+          <w:sz w:val="18"/>
         </w:rPr>
-        <w:t>flowchart LR</w:t>
-        <w:br/>
-        <w:t xml:space="preserve">  U[Org users] --&gt;|HTTPS| EDGE[App Gateway WAF_v2 / Front Door]</w:t>
-        <w:br/>
-        <w:t xml:space="preserve">  EDGE --&gt; ING[AGIC ingress]</w:t>
-        <w:br/>
-        <w:t xml:space="preserve">  subgraph AKS [AKS private cluster]</w:t>
-        <w:br/>
-        <w:t xml:space="preserve">    ING --&gt; FE[front end pods - nginx]</w:t>
-        <w:br/>
-        <w:t xml:space="preserve">    ING --&gt; API[NestJS API pods + HPA]</w:t>
-        <w:br/>
-        <w:t xml:space="preserve">    SA[ServiceAccount + Workload Identity] --- API</w:t>
-        <w:br/>
-        <w:t xml:space="preserve">  end</w:t>
-        <w:br/>
-        <w:t xml:space="preserve">  subgraph VNet</w:t>
-        <w:br/>
-        <w:t xml:space="preserve">    API --&gt; PE1[(Private Endpoint)] --&gt; PG[(PostgreSQL Flexible Server)]</w:t>
-        <w:br/>
-        <w:t xml:space="preserve">    API --&gt; PE2[(Private Endpoint)] --&gt; KV[Key Vault]</w:t>
-        <w:br/>
-        <w:t xml:space="preserve">    API --&gt; PE3[(Private Endpoint)] --&gt; AOAI[Azure OpenAI]</w:t>
-        <w:br/>
-        <w:t xml:space="preserve">    KUBELET[kubelet identity] --&gt; PE4[(Private Endpoint)] --&gt; ACR[Container Registry]</w:t>
-        <w:br/>
-        <w:t xml:space="preserve">    API --&gt; FW[Azure Firewall / NAT]</w:t>
-        <w:br/>
-        <w:t xml:space="preserve">  end</w:t>
-        <w:br/>
-        <w:t xml:space="preserve">  FW --&gt;|allowlisted FQDNs| EXT[External data sources / agent APIs]</w:t>
-        <w:br/>
-        <w:t xml:space="preserve">  API --&gt;|OIDC + Graph| ENTRA[Microsoft Entra ID]</w:t>
-        <w:br/>
-        <w:t/>
+        <w:t>Figure 1 — UIFactory on AKS: ingress, in-cluster workloads with workload identity, and PaaS dependencies reached over private endpoints with controlled egress.</w:t>
       </w:r>
     </w:p>
     <w:p>
@@ -1805,6 +1810,58 @@
       </w:pPr>
       <w:r>
         <w:t>5. Networking &amp; security</w:t>
+      </w:r>
+    </w:p>
+    <w:p>
+      <w:pPr>
+        <w:jc w:val="center"/>
+      </w:pPr>
+      <w:r>
+        <w:drawing>
+          <wp:inline xmlns:a="http://schemas.openxmlformats.org/drawingml/2006/main" xmlns:pic="http://schemas.openxmlformats.org/drawingml/2006/picture">
+            <wp:extent cx="5943600" cy="3526775"/>
+            <wp:docPr id="2" name="Picture 2"/>
+            <wp:cNvGraphicFramePr>
+              <a:graphicFrameLocks noChangeAspect="1"/>
+            </wp:cNvGraphicFramePr>
+            <a:graphic>
+              <a:graphicData uri="http://schemas.openxmlformats.org/drawingml/2006/picture">
+                <pic:pic>
+                  <pic:nvPicPr>
+                    <pic:cNvPr id="0" name="network.png"/>
+                    <pic:cNvPicPr/>
+                  </pic:nvPicPr>
+                  <pic:blipFill>
+                    <a:blip r:embed="rId10"/>
+                    <a:stretch>
+                      <a:fillRect/>
+                    </a:stretch>
+                  </pic:blipFill>
+                  <pic:spPr>
+                    <a:xfrm>
+                      <a:off x="0" y="0"/>
+                      <a:ext cx="5943600" cy="3526775"/>
+                    </a:xfrm>
+                    <a:prstGeom prst="rect"/>
+                  </pic:spPr>
+                </pic:pic>
+              </a:graphicData>
+            </a:graphic>
+          </wp:inline>
+        </w:drawing>
+      </w:r>
+    </w:p>
+    <w:p>
+      <w:pPr>
+        <w:jc w:val="center"/>
+      </w:pPr>
+      <w:r>
+        <w:rPr>
+          <w:i/>
+          <w:color w:val="6B7785"/>
+          <w:sz w:val="18"/>
+        </w:rPr>
+        <w:t>Figure 2 — Per-environment network topology: VNet subnets, AKS, App Gateway ingress, private endpoints to PaaS, private DNS, and Azure Firewall egress.</w:t>
       </w:r>
     </w:p>
     <w:p>

</xml_diff>

<commit_message>
Add Dockerfiles + Helm chart for AKS; sequence diagrams in deploy manual
- Dockerfile (backend) and Dockerfile.frontend (nginx SPA) + .dockerignore
  and frontend/nginx.conf, built from the repo root.
- charts/uifactory Helm chart: API/frontend Deployments + Services, AGIC
  Ingress, HPA, ServiceAccount (Entra Workload Identity), Key Vault
  SecretProviderClass (CSI), ConfigMap, and a Prisma migration Job
  (Helm pre-upgrade hook). values-dev (embedded SQLite demo) and
  values-test/prod (PostgreSQL + Key Vault + migrations) + chart README.
- main.ts: trust proxy so Secure session cookies work behind the ingress.
- Deployment manual: add §1.3 with five sequence diagrams (SSO login,
  secrets via CSI, runtime data, AI/agent, CI/CD) plus the existing
  architecture and network diagrams.

https://claude.ai/code/session_01PRGcYxMGt9vC6d1FPpjhaQ
</commit_message>
<xml_diff>
--- a/docs/UIFactory-Azure-Deployment-Manual.docx
+++ b/docs/UIFactory-Azure-Deployment-Manual.docx
@@ -837,6 +837,288 @@
           <w:sz w:val="18"/>
         </w:rPr>
         <w:t>Figure 1 — UIFactory on AKS: ingress, in-cluster workloads with workload identity, and PaaS dependencies reached over private endpoints with controlled egress.</w:t>
+      </w:r>
+    </w:p>
+    <w:p>
+      <w:r>
+        <w:br w:type="page"/>
+      </w:r>
+    </w:p>
+    <w:p>
+      <w:pPr>
+        <w:pStyle w:val="Heading2"/>
+      </w:pPr>
+      <w:r>
+        <w:t>1.3 Key sequence flows</w:t>
+      </w:r>
+    </w:p>
+    <w:p>
+      <w:r>
+        <w:rPr>
+          <w:b w:val="0"/>
+          <w:i w:val="0"/>
+        </w:rPr>
+        <w:t>The diagrams below cover the main runtime and delivery flows referenced throughout this manual.</w:t>
+      </w:r>
+    </w:p>
+    <w:p>
+      <w:pPr>
+        <w:jc w:val="center"/>
+      </w:pPr>
+      <w:r>
+        <w:drawing>
+          <wp:inline xmlns:a="http://schemas.openxmlformats.org/drawingml/2006/main" xmlns:pic="http://schemas.openxmlformats.org/drawingml/2006/picture">
+            <wp:extent cx="5943600" cy="4403993"/>
+            <wp:docPr id="2" name="Picture 2"/>
+            <wp:cNvGraphicFramePr>
+              <a:graphicFrameLocks noChangeAspect="1"/>
+            </wp:cNvGraphicFramePr>
+            <a:graphic>
+              <a:graphicData uri="http://schemas.openxmlformats.org/drawingml/2006/picture">
+                <pic:pic>
+                  <pic:nvPicPr>
+                    <pic:cNvPr id="0" name="seq-login.png"/>
+                    <pic:cNvPicPr/>
+                  </pic:nvPicPr>
+                  <pic:blipFill>
+                    <a:blip r:embed="rId10"/>
+                    <a:stretch>
+                      <a:fillRect/>
+                    </a:stretch>
+                  </pic:blipFill>
+                  <pic:spPr>
+                    <a:xfrm>
+                      <a:off x="0" y="0"/>
+                      <a:ext cx="5943600" cy="4403993"/>
+                    </a:xfrm>
+                    <a:prstGeom prst="rect"/>
+                  </pic:spPr>
+                </pic:pic>
+              </a:graphicData>
+            </a:graphic>
+          </wp:inline>
+        </w:drawing>
+      </w:r>
+    </w:p>
+    <w:p>
+      <w:pPr>
+        <w:jc w:val="center"/>
+      </w:pPr>
+      <w:r>
+        <w:rPr>
+          <w:i/>
+          <w:color w:val="6B7785"/>
+          <w:sz w:val="18"/>
+        </w:rPr>
+        <w:t>Figure 2 — SSO login (Entra ID OIDC authorization-code flow).</w:t>
+      </w:r>
+    </w:p>
+    <w:p>
+      <w:pPr>
+        <w:jc w:val="center"/>
+      </w:pPr>
+      <w:r>
+        <w:drawing>
+          <wp:inline xmlns:a="http://schemas.openxmlformats.org/drawingml/2006/main" xmlns:pic="http://schemas.openxmlformats.org/drawingml/2006/picture">
+            <wp:extent cx="5943600" cy="2756971"/>
+            <wp:docPr id="3" name="Picture 3"/>
+            <wp:cNvGraphicFramePr>
+              <a:graphicFrameLocks noChangeAspect="1"/>
+            </wp:cNvGraphicFramePr>
+            <a:graphic>
+              <a:graphicData uri="http://schemas.openxmlformats.org/drawingml/2006/picture">
+                <pic:pic>
+                  <pic:nvPicPr>
+                    <pic:cNvPr id="0" name="seq-secrets.png"/>
+                    <pic:cNvPicPr/>
+                  </pic:nvPicPr>
+                  <pic:blipFill>
+                    <a:blip r:embed="rId11"/>
+                    <a:stretch>
+                      <a:fillRect/>
+                    </a:stretch>
+                  </pic:blipFill>
+                  <pic:spPr>
+                    <a:xfrm>
+                      <a:off x="0" y="0"/>
+                      <a:ext cx="5943600" cy="2756971"/>
+                    </a:xfrm>
+                    <a:prstGeom prst="rect"/>
+                  </pic:spPr>
+                </pic:pic>
+              </a:graphicData>
+            </a:graphic>
+          </wp:inline>
+        </w:drawing>
+      </w:r>
+    </w:p>
+    <w:p>
+      <w:pPr>
+        <w:jc w:val="center"/>
+      </w:pPr>
+      <w:r>
+        <w:rPr>
+          <w:i/>
+          <w:color w:val="6B7785"/>
+          <w:sz w:val="18"/>
+        </w:rPr>
+        <w:t>Figure 3 — Pod startup: secrets via Key Vault Secrets Store CSI + Workload Identity.</w:t>
+      </w:r>
+    </w:p>
+    <w:p>
+      <w:pPr>
+        <w:jc w:val="center"/>
+      </w:pPr>
+      <w:r>
+        <w:drawing>
+          <wp:inline xmlns:a="http://schemas.openxmlformats.org/drawingml/2006/main" xmlns:pic="http://schemas.openxmlformats.org/drawingml/2006/picture">
+            <wp:extent cx="5943600" cy="2792775"/>
+            <wp:docPr id="4" name="Picture 4"/>
+            <wp:cNvGraphicFramePr>
+              <a:graphicFrameLocks noChangeAspect="1"/>
+            </wp:cNvGraphicFramePr>
+            <a:graphic>
+              <a:graphicData uri="http://schemas.openxmlformats.org/drawingml/2006/picture">
+                <pic:pic>
+                  <pic:nvPicPr>
+                    <pic:cNvPr id="0" name="seq-data.png"/>
+                    <pic:cNvPicPr/>
+                  </pic:nvPicPr>
+                  <pic:blipFill>
+                    <a:blip r:embed="rId12"/>
+                    <a:stretch>
+                      <a:fillRect/>
+                    </a:stretch>
+                  </pic:blipFill>
+                  <pic:spPr>
+                    <a:xfrm>
+                      <a:off x="0" y="0"/>
+                      <a:ext cx="5943600" cy="2792775"/>
+                    </a:xfrm>
+                    <a:prstGeom prst="rect"/>
+                  </pic:spPr>
+                </pic:pic>
+              </a:graphicData>
+            </a:graphic>
+          </wp:inline>
+        </w:drawing>
+      </w:r>
+    </w:p>
+    <w:p>
+      <w:pPr>
+        <w:jc w:val="center"/>
+      </w:pPr>
+      <w:r>
+        <w:rPr>
+          <w:i/>
+          <w:color w:val="6B7785"/>
+          <w:sz w:val="18"/>
+        </w:rPr>
+        <w:t>Figure 4 — Runtime request and live data fetch (session-authorized, private DB).</w:t>
+      </w:r>
+    </w:p>
+    <w:p>
+      <w:pPr>
+        <w:jc w:val="center"/>
+      </w:pPr>
+      <w:r>
+        <w:drawing>
+          <wp:inline xmlns:a="http://schemas.openxmlformats.org/drawingml/2006/main" xmlns:pic="http://schemas.openxmlformats.org/drawingml/2006/picture">
+            <wp:extent cx="5943600" cy="3526775"/>
+            <wp:docPr id="5" name="Picture 5"/>
+            <wp:cNvGraphicFramePr>
+              <a:graphicFrameLocks noChangeAspect="1"/>
+            </wp:cNvGraphicFramePr>
+            <a:graphic>
+              <a:graphicData uri="http://schemas.openxmlformats.org/drawingml/2006/picture">
+                <pic:pic>
+                  <pic:nvPicPr>
+                    <pic:cNvPr id="0" name="seq-ai.png"/>
+                    <pic:cNvPicPr/>
+                  </pic:nvPicPr>
+                  <pic:blipFill>
+                    <a:blip r:embed="rId13"/>
+                    <a:stretch>
+                      <a:fillRect/>
+                    </a:stretch>
+                  </pic:blipFill>
+                  <pic:spPr>
+                    <a:xfrm>
+                      <a:off x="0" y="0"/>
+                      <a:ext cx="5943600" cy="3526775"/>
+                    </a:xfrm>
+                    <a:prstGeom prst="rect"/>
+                  </pic:spPr>
+                </pic:pic>
+              </a:graphicData>
+            </a:graphic>
+          </wp:inline>
+        </w:drawing>
+      </w:r>
+    </w:p>
+    <w:p>
+      <w:pPr>
+        <w:jc w:val="center"/>
+      </w:pPr>
+      <w:r>
+        <w:rPr>
+          <w:i/>
+          <w:color w:val="6B7785"/>
+          <w:sz w:val="18"/>
+        </w:rPr>
+        <w:t>Figure 5 — AI generation / chat: Azure OpenAI or an external agent API via egress firewall.</w:t>
+      </w:r>
+    </w:p>
+    <w:p>
+      <w:pPr>
+        <w:jc w:val="center"/>
+      </w:pPr>
+      <w:r>
+        <w:drawing>
+          <wp:inline xmlns:a="http://schemas.openxmlformats.org/drawingml/2006/main" xmlns:pic="http://schemas.openxmlformats.org/drawingml/2006/picture">
+            <wp:extent cx="5943600" cy="3186629"/>
+            <wp:docPr id="6" name="Picture 6"/>
+            <wp:cNvGraphicFramePr>
+              <a:graphicFrameLocks noChangeAspect="1"/>
+            </wp:cNvGraphicFramePr>
+            <a:graphic>
+              <a:graphicData uri="http://schemas.openxmlformats.org/drawingml/2006/picture">
+                <pic:pic>
+                  <pic:nvPicPr>
+                    <pic:cNvPr id="0" name="seq-cicd.png"/>
+                    <pic:cNvPicPr/>
+                  </pic:nvPicPr>
+                  <pic:blipFill>
+                    <a:blip r:embed="rId14"/>
+                    <a:stretch>
+                      <a:fillRect/>
+                    </a:stretch>
+                  </pic:blipFill>
+                  <pic:spPr>
+                    <a:xfrm>
+                      <a:off x="0" y="0"/>
+                      <a:ext cx="5943600" cy="3186629"/>
+                    </a:xfrm>
+                    <a:prstGeom prst="rect"/>
+                  </pic:spPr>
+                </pic:pic>
+              </a:graphicData>
+            </a:graphic>
+          </wp:inline>
+        </w:drawing>
+      </w:r>
+    </w:p>
+    <w:p>
+      <w:pPr>
+        <w:jc w:val="center"/>
+      </w:pPr>
+      <w:r>
+        <w:rPr>
+          <w:i/>
+          <w:color w:val="6B7785"/>
+          <w:sz w:val="18"/>
+        </w:rPr>
+        <w:t>Figure 6 — CI/CD: build, push, migrate (Helm hook) and rolling deploy to AKS.</w:t>
       </w:r>
     </w:p>
     <w:p>
@@ -1820,7 +2102,7 @@
         <w:drawing>
           <wp:inline xmlns:a="http://schemas.openxmlformats.org/drawingml/2006/main" xmlns:pic="http://schemas.openxmlformats.org/drawingml/2006/picture">
             <wp:extent cx="5943600" cy="3526775"/>
-            <wp:docPr id="2" name="Picture 2"/>
+            <wp:docPr id="7" name="Picture 7"/>
             <wp:cNvGraphicFramePr>
               <a:graphicFrameLocks noChangeAspect="1"/>
             </wp:cNvGraphicFramePr>
@@ -1832,7 +2114,7 @@
                     <pic:cNvPicPr/>
                   </pic:nvPicPr>
                   <pic:blipFill>
-                    <a:blip r:embed="rId10"/>
+                    <a:blip r:embed="rId15"/>
                     <a:stretch>
                       <a:fillRect/>
                     </a:stretch>
@@ -1861,7 +2143,7 @@
           <w:color w:val="6B7785"/>
           <w:sz w:val="18"/>
         </w:rPr>
-        <w:t>Figure 2 — Per-environment network topology: VNet subnets, AKS, App Gateway ingress, private endpoints to PaaS, private DNS, and Azure Firewall egress.</w:t>
+        <w:t>Figure 7 — Per-environment network topology: VNet subnets, AKS, App Gateway ingress, private endpoints to PaaS, private DNS, and Azure Firewall egress.</w:t>
       </w:r>
     </w:p>
     <w:p>

</xml_diff>